<commit_message>
docs(informe): inserta 14 capturas de evidencia y actualiza IDs de cuenta/ARNs
- Embebe evidencias (consola AWS, GitHub Actions, navegador) en cada seccion IE1-IE7.
- Actualiza ID de cuenta (166658674120), DNS del ALB, VPC y Security Groups a los
  valores de la sesion Learner Lab del 26-06; agrega nota de IDs por sesion.
- Regenera Informe-Tecnico-EP3.docx con las imagenes embebidas.

Co-Authored-By: Claude Opus 4.8 <noreply@anthropic.com>
Claude-Session: https://claude.ai/code/session_01RGSUNUR7x2rUumoScYtZwM
</commit_message>
<xml_diff>
--- a/docs/Informe-Tecnico-EP3.docx
+++ b/docs/Informe-Tecnico-EP3.docx
@@ -28,7 +28,7 @@
         </w:p>
       </w:sdtContent>
     </w:sdt>
-    <w:bookmarkStart w:id="30" w:name="Xe7b01e08ff36dbd2d50ba7518174c6314b83a7e"/>
+    <w:bookmarkStart w:id="72" w:name="Xe7b01e08ff36dbd2d50ba7518174c6314b83a7e"/>
     <w:p>
       <w:pPr>
         <w:pStyle w:val="Heading1"/>
@@ -154,47 +154,75 @@
         <w:pStyle w:val="BlockText"/>
       </w:pPr>
       <w:r>
-        <w:t xml:space="preserve">Nota de uso: los bloques</w:t>
-      </w:r>
-      <w:r>
-        <w:t xml:space="preserve"> </w:t>
-      </w:r>
-      <w:r>
-        <w:rPr>
-          <w:rStyle w:val="VerbatimChar"/>
-        </w:rPr>
-        <w:t xml:space="preserve">[INSERTAR CAPTURA …]</w:t>
-      </w:r>
-      <w:r>
-        <w:t xml:space="preserve"> </w:t>
-      </w:r>
-      <w:r>
-        <w:t xml:space="preserve">indican dónde pegar la evidencia que se</w:t>
-      </w:r>
-      <w:r>
-        <w:t xml:space="preserve"> </w:t>
-      </w:r>
-      <w:r>
-        <w:t xml:space="preserve">obtiene</w:t>
-      </w:r>
-      <w:r>
-        <w:t xml:space="preserve"> </w:t>
-      </w:r>
-      <w:r>
-        <w:rPr>
-          <w:b/>
-          <w:bCs/>
-        </w:rPr>
-        <w:t xml:space="preserve">dentro de AWS Academy con el laboratorio encendido</w:t>
-      </w:r>
-      <w:r>
-        <w:t xml:space="preserve">. Todo el resto del informe</w:t>
-      </w:r>
-      <w:r>
-        <w:t xml:space="preserve"> </w:t>
-      </w:r>
-      <w:r>
-        <w:t xml:space="preserve">ya está completo y no requiere AWS.</w:t>
+        <w:rPr>
+          <w:b/>
+          <w:bCs/>
+        </w:rPr>
+        <w:t xml:space="preserve">Nota sobre los identificadores:</w:t>
+      </w:r>
+      <w:r>
+        <w:t xml:space="preserve"> </w:t>
+      </w:r>
+      <w:r>
+        <w:t xml:space="preserve">las capturas de evidencia están embebidas en cada sección</w:t>
+      </w:r>
+      <w:r>
+        <w:t xml:space="preserve"> </w:t>
+      </w:r>
+      <w:r>
+        <w:t xml:space="preserve">(consola AWS, GitHub Actions y navegador). Los identificadores que aparecen (ID de cuenta, ARNs,</w:t>
+      </w:r>
+      <w:r>
+        <w:t xml:space="preserve"> </w:t>
+      </w:r>
+      <w:r>
+        <w:t xml:space="preserve">DNS de balanceadores, IDs de VPC/Security Group) corresponden a la sesión de</w:t>
+      </w:r>
+      <w:r>
+        <w:t xml:space="preserve"> </w:t>
+      </w:r>
+      <w:r>
+        <w:rPr>
+          <w:b/>
+          <w:bCs/>
+        </w:rPr>
+        <w:t xml:space="preserve">AWS Academy</w:t>
+      </w:r>
+      <w:r>
+        <w:rPr>
+          <w:b/>
+          <w:bCs/>
+        </w:rPr>
+        <w:t xml:space="preserve"> </w:t>
+      </w:r>
+      <w:r>
+        <w:rPr>
+          <w:b/>
+          <w:bCs/>
+        </w:rPr>
+        <w:t xml:space="preserve">Learner Lab del 26-06-2026</w:t>
+      </w:r>
+      <w:r>
+        <w:t xml:space="preserve">. El Learner Lab</w:t>
+      </w:r>
+      <w:r>
+        <w:t xml:space="preserve"> </w:t>
+      </w:r>
+      <w:r>
+        <w:rPr>
+          <w:b/>
+          <w:bCs/>
+        </w:rPr>
+        <w:t xml:space="preserve">regenera estos valores cada vez que se reinicia</w:t>
+      </w:r>
+      <w:r>
+        <w:t xml:space="preserve">,</w:t>
+      </w:r>
+      <w:r>
+        <w:t xml:space="preserve"> </w:t>
+      </w:r>
+      <w:r>
+        <w:t xml:space="preserve">por lo que pueden variar entre una sesión y otra.</w:t>
       </w:r>
     </w:p>
     <w:p>
@@ -549,7 +577,7 @@
           <w:rFonts w:ascii="Consolas" w:hAnsi="Consolas"/>
           <w:sz w:val="15"/>
         </w:rPr>
-        <w:t xml:space="preserve">                 │   ALB público :80    │  tienda-alb-1107170895.us-east-1.elb.amazonaws.com</w:t>
+        <w:t xml:space="preserve">                 │   ALB público :80    │  tienda-alb-93590141.us-east-1.elb.amazonaws.com</w:t>
       </w:r>
       <w:r>
         <w:rPr>
@@ -1419,7 +1447,7 @@
     </w:p>
     <w:bookmarkEnd w:id="13"/>
     <w:bookmarkEnd w:id="14"/>
-    <w:bookmarkStart w:id="15" w:name="X895e236769ef741e713e52d35522e19530ec5aa"/>
+    <w:bookmarkStart w:id="24" w:name="X895e236769ef741e713e52d35522e19530ec5aa"/>
     <w:p>
       <w:pPr>
         <w:pStyle w:val="Heading2"/>
@@ -1502,7 +1530,7 @@
               <w:rPr>
                 <w:rStyle w:val="VerbatimChar"/>
               </w:rPr>
-              <w:t xml:space="preserve">471112880379</w:t>
+              <w:t xml:space="preserve">166658674120</w:t>
             </w:r>
           </w:p>
         </w:tc>
@@ -1595,7 +1623,7 @@
               <w:rPr>
                 <w:rStyle w:val="VerbatimChar"/>
               </w:rPr>
-              <w:t xml:space="preserve">vpc-0b7fae2d77b4d6487</w:t>
+              <w:t xml:space="preserve">vpc-00719b133c42a925b</w:t>
             </w:r>
           </w:p>
         </w:tc>
@@ -1622,7 +1650,7 @@
               <w:rPr>
                 <w:rStyle w:val="VerbatimChar"/>
               </w:rPr>
-              <w:t xml:space="preserve">arn:aws:iam::471112880379:role/LabRole</w:t>
+              <w:t xml:space="preserve">arn:aws:iam::166658674120:role/LabRole</w:t>
             </w:r>
             <w:r>
               <w:t xml:space="preserve"> </w:t>
@@ -1667,7 +1695,7 @@
               <w:rPr>
                 <w:rStyle w:val="VerbatimChar"/>
               </w:rPr>
-              <w:t xml:space="preserve">sg-03e5fc41b725da870</w:t>
+              <w:t xml:space="preserve">sg-04d81debc111aede1</w:t>
             </w:r>
             <w:r>
               <w:t xml:space="preserve">) — entrante 80 desde Internet</w:t>
@@ -1709,7 +1737,7 @@
               <w:rPr>
                 <w:rStyle w:val="VerbatimChar"/>
               </w:rPr>
-              <w:t xml:space="preserve">sg-0a86be9dc2a5ab13c</w:t>
+              <w:t xml:space="preserve">sg-082c82cf2a55dd0be</w:t>
             </w:r>
             <w:r>
               <w:t xml:space="preserve">) — 80/3001 desde el ALB, 3306 dentro de la VPC</w:t>
@@ -1809,22 +1837,143 @@
     </w:p>
     <w:p>
       <w:pPr>
-        <w:pStyle w:val="BlockText"/>
-      </w:pPr>
-      <w:r>
-        <w:rPr>
-          <w:rStyle w:val="VerbatimChar"/>
-        </w:rPr>
-        <w:t xml:space="preserve">[INSERTAR CAPTURA: consola ECS → Clúster tienda-cluster mostrando los 3 servicios ACTIVE]</w:t>
-      </w:r>
-      <w:r>
-        <w:t xml:space="preserve"> </w:t>
-      </w:r>
-      <w:r>
-        <w:rPr>
-          <w:rStyle w:val="VerbatimChar"/>
-        </w:rPr>
-        <w:t xml:space="preserve">[INSERTAR CAPTURA: EC2 → Security Groups, reglas inbound de tienda-alb-sg y tienda-ecs-sg]</w:t>
+        <w:pStyle w:val="BodyText"/>
+      </w:pPr>
+      <w:r>
+        <w:drawing>
+          <wp:inline>
+            <wp:extent cx="5334000" cy="3333750"/>
+            <wp:effectExtent b="0" l="0" r="0" t="0"/>
+            <wp:docPr descr="Figura 1 — Clúster tienda-cluster (Fargate) con los 3 servicios activos: tienda-db, tienda-backend y tienda-frontend." title="" id="16" name="Picture"/>
+            <a:graphic>
+              <a:graphicData uri="http://schemas.openxmlformats.org/drawingml/2006/picture">
+                <pic:pic>
+                  <pic:nvPicPr>
+                    <pic:cNvPr descr="evidencias/ie1-cluster-servicios.png" id="17" name="Picture"/>
+                    <pic:cNvPicPr>
+                      <a:picLocks noChangeArrowheads="1" noChangeAspect="1"/>
+                    </pic:cNvPicPr>
+                  </pic:nvPicPr>
+                  <pic:blipFill>
+                    <a:blip r:embed="rId15"/>
+                    <a:stretch>
+                      <a:fillRect/>
+                    </a:stretch>
+                  </pic:blipFill>
+                  <pic:spPr bwMode="auto">
+                    <a:xfrm>
+                      <a:off x="0" y="0"/>
+                      <a:ext cx="5334000" cy="3333750"/>
+                    </a:xfrm>
+                    <a:prstGeom prst="rect">
+                      <a:avLst/>
+                    </a:prstGeom>
+                    <a:noFill/>
+                    <a:ln w="9525">
+                      <a:noFill/>
+                      <a:headEnd/>
+                      <a:tailEnd/>
+                    </a:ln>
+                  </pic:spPr>
+                </pic:pic>
+              </a:graphicData>
+            </a:graphic>
+          </wp:inline>
+        </w:drawing>
+      </w:r>
+    </w:p>
+    <w:p>
+      <w:pPr>
+        <w:pStyle w:val="BodyText"/>
+      </w:pPr>
+      <w:r>
+        <w:drawing>
+          <wp:inline>
+            <wp:extent cx="5334000" cy="3333750"/>
+            <wp:effectExtent b="0" l="0" r="0" t="0"/>
+            <wp:docPr descr="Figura 2 — Security Group tienda-ecs-sg: reglas de entrada (80/3001 desde el ALB, 3306 dentro de la VPC)." title="" id="19" name="Picture"/>
+            <a:graphic>
+              <a:graphicData uri="http://schemas.openxmlformats.org/drawingml/2006/picture">
+                <pic:pic>
+                  <pic:nvPicPr>
+                    <pic:cNvPr descr="evidencias/ie1-sg-ecs.png" id="20" name="Picture"/>
+                    <pic:cNvPicPr>
+                      <a:picLocks noChangeArrowheads="1" noChangeAspect="1"/>
+                    </pic:cNvPicPr>
+                  </pic:nvPicPr>
+                  <pic:blipFill>
+                    <a:blip r:embed="rId18"/>
+                    <a:stretch>
+                      <a:fillRect/>
+                    </a:stretch>
+                  </pic:blipFill>
+                  <pic:spPr bwMode="auto">
+                    <a:xfrm>
+                      <a:off x="0" y="0"/>
+                      <a:ext cx="5334000" cy="3333750"/>
+                    </a:xfrm>
+                    <a:prstGeom prst="rect">
+                      <a:avLst/>
+                    </a:prstGeom>
+                    <a:noFill/>
+                    <a:ln w="9525">
+                      <a:noFill/>
+                      <a:headEnd/>
+                      <a:tailEnd/>
+                    </a:ln>
+                  </pic:spPr>
+                </pic:pic>
+              </a:graphicData>
+            </a:graphic>
+          </wp:inline>
+        </w:drawing>
+      </w:r>
+    </w:p>
+    <w:p>
+      <w:pPr>
+        <w:pStyle w:val="BodyText"/>
+      </w:pPr>
+      <w:r>
+        <w:drawing>
+          <wp:inline>
+            <wp:extent cx="5334000" cy="3333750"/>
+            <wp:effectExtent b="0" l="0" r="0" t="0"/>
+            <wp:docPr descr="Figura 3 — Security Group tienda-alb-sg: regla de entrada del puerto 80 desde Internet." title="" id="22" name="Picture"/>
+            <a:graphic>
+              <a:graphicData uri="http://schemas.openxmlformats.org/drawingml/2006/picture">
+                <pic:pic>
+                  <pic:nvPicPr>
+                    <pic:cNvPr descr="evidencias/ie1-sg-alb.png" id="23" name="Picture"/>
+                    <pic:cNvPicPr>
+                      <a:picLocks noChangeArrowheads="1" noChangeAspect="1"/>
+                    </pic:cNvPicPr>
+                  </pic:nvPicPr>
+                  <pic:blipFill>
+                    <a:blip r:embed="rId21"/>
+                    <a:stretch>
+                      <a:fillRect/>
+                    </a:stretch>
+                  </pic:blipFill>
+                  <pic:spPr bwMode="auto">
+                    <a:xfrm>
+                      <a:off x="0" y="0"/>
+                      <a:ext cx="5334000" cy="3333750"/>
+                    </a:xfrm>
+                    <a:prstGeom prst="rect">
+                      <a:avLst/>
+                    </a:prstGeom>
+                    <a:noFill/>
+                    <a:ln w="9525">
+                      <a:noFill/>
+                      <a:headEnd/>
+                      <a:tailEnd/>
+                    </a:ln>
+                  </pic:spPr>
+                </pic:pic>
+              </a:graphicData>
+            </a:graphic>
+          </wp:inline>
+        </w:drawing>
       </w:r>
     </w:p>
     <w:p>
@@ -1834,8 +1983,8 @@
         </w:pict>
       </w:r>
     </w:p>
-    <w:bookmarkEnd w:id="15"/>
-    <w:bookmarkStart w:id="16" w:name="X78775254cfe12ffa2d526471a3a1c8549238e56"/>
+    <w:bookmarkEnd w:id="24"/>
+    <w:bookmarkStart w:id="37" w:name="X78775254cfe12ffa2d526471a3a1c8549238e56"/>
     <w:p>
       <w:pPr>
         <w:pStyle w:val="Heading2"/>
@@ -2562,7 +2711,7 @@
         <w:rPr>
           <w:rStyle w:val="VerbatimChar"/>
         </w:rPr>
-        <w:t xml:space="preserve">http://tienda-alb-1107170895.us-east-1.elb.amazonaws.com</w:t>
+        <w:t xml:space="preserve">http://tienda-alb-93590141.us-east-1.elb.amazonaws.com</w:t>
       </w:r>
     </w:p>
     <w:p>
@@ -2641,22 +2790,190 @@
     </w:p>
     <w:p>
       <w:pPr>
-        <w:pStyle w:val="BlockText"/>
-      </w:pPr>
-      <w:r>
-        <w:rPr>
-          <w:rStyle w:val="VerbatimChar"/>
-        </w:rPr>
-        <w:t xml:space="preserve">[INSERTAR CAPTURA: la app abierta en el navegador con la tabla de productos cargada]</w:t>
-      </w:r>
-      <w:r>
-        <w:t xml:space="preserve"> </w:t>
-      </w:r>
-      <w:r>
-        <w:rPr>
-          <w:rStyle w:val="VerbatimChar"/>
-        </w:rPr>
-        <w:t xml:space="preserve">[INSERTAR CAPTURA: target groups tg-frontend y tg-backend en estado "healthy"]</w:t>
+        <w:pStyle w:val="BodyText"/>
+      </w:pPr>
+      <w:r>
+        <w:drawing>
+          <wp:inline>
+            <wp:extent cx="5334000" cy="3333750"/>
+            <wp:effectExtent b="0" l="0" r="0" t="0"/>
+            <wp:docPr descr="Figura 4 — Aplicación funcionando en el navegador (URL del ALB): tabla de productos cargada desde el backend y formulario CRUD. Demuestra Frontend → Backend → MySQL operativo." title="" id="26" name="Picture"/>
+            <a:graphic>
+              <a:graphicData uri="http://schemas.openxmlformats.org/drawingml/2006/picture">
+                <pic:pic>
+                  <pic:nvPicPr>
+                    <pic:cNvPr descr="evidencias/ie2-app-navegador.png" id="27" name="Picture"/>
+                    <pic:cNvPicPr>
+                      <a:picLocks noChangeArrowheads="1" noChangeAspect="1"/>
+                    </pic:cNvPicPr>
+                  </pic:nvPicPr>
+                  <pic:blipFill>
+                    <a:blip r:embed="rId25"/>
+                    <a:stretch>
+                      <a:fillRect/>
+                    </a:stretch>
+                  </pic:blipFill>
+                  <pic:spPr bwMode="auto">
+                    <a:xfrm>
+                      <a:off x="0" y="0"/>
+                      <a:ext cx="5334000" cy="3333750"/>
+                    </a:xfrm>
+                    <a:prstGeom prst="rect">
+                      <a:avLst/>
+                    </a:prstGeom>
+                    <a:noFill/>
+                    <a:ln w="9525">
+                      <a:noFill/>
+                      <a:headEnd/>
+                      <a:tailEnd/>
+                    </a:ln>
+                  </pic:spPr>
+                </pic:pic>
+              </a:graphicData>
+            </a:graphic>
+          </wp:inline>
+        </w:drawing>
+      </w:r>
+    </w:p>
+    <w:p>
+      <w:pPr>
+        <w:pStyle w:val="BodyText"/>
+      </w:pPr>
+      <w:r>
+        <w:drawing>
+          <wp:inline>
+            <wp:extent cx="5334000" cy="3333750"/>
+            <wp:effectExtent b="0" l="0" r="0" t="0"/>
+            <wp:docPr descr="Figura 5 — Regla del listener HTTP:80 del ALB: el patrón de ruta /api/* se enruta al target group del backend." title="" id="29" name="Picture"/>
+            <a:graphic>
+              <a:graphicData uri="http://schemas.openxmlformats.org/drawingml/2006/picture">
+                <pic:pic>
+                  <pic:nvPicPr>
+                    <pic:cNvPr descr="evidencias/ie2-alb-routing.png" id="30" name="Picture"/>
+                    <pic:cNvPicPr>
+                      <a:picLocks noChangeArrowheads="1" noChangeAspect="1"/>
+                    </pic:cNvPicPr>
+                  </pic:nvPicPr>
+                  <pic:blipFill>
+                    <a:blip r:embed="rId28"/>
+                    <a:stretch>
+                      <a:fillRect/>
+                    </a:stretch>
+                  </pic:blipFill>
+                  <pic:spPr bwMode="auto">
+                    <a:xfrm>
+                      <a:off x="0" y="0"/>
+                      <a:ext cx="5334000" cy="3333750"/>
+                    </a:xfrm>
+                    <a:prstGeom prst="rect">
+                      <a:avLst/>
+                    </a:prstGeom>
+                    <a:noFill/>
+                    <a:ln w="9525">
+                      <a:noFill/>
+                      <a:headEnd/>
+                      <a:tailEnd/>
+                    </a:ln>
+                  </pic:spPr>
+                </pic:pic>
+              </a:graphicData>
+            </a:graphic>
+          </wp:inline>
+        </w:drawing>
+      </w:r>
+    </w:p>
+    <w:p>
+      <w:pPr>
+        <w:pStyle w:val="BodyText"/>
+      </w:pPr>
+      <w:r>
+        <w:drawing>
+          <wp:inline>
+            <wp:extent cx="5334000" cy="3333750"/>
+            <wp:effectExtent b="0" l="0" r="0" t="0"/>
+            <wp:docPr descr="Figura 6 — Target group del backend con destinos registrados (estado de salud de las tasks)." title="" id="32" name="Picture"/>
+            <a:graphic>
+              <a:graphicData uri="http://schemas.openxmlformats.org/drawingml/2006/picture">
+                <pic:pic>
+                  <pic:nvPicPr>
+                    <pic:cNvPr descr="evidencias/ie2-target-group.png" id="33" name="Picture"/>
+                    <pic:cNvPicPr>
+                      <a:picLocks noChangeArrowheads="1" noChangeAspect="1"/>
+                    </pic:cNvPicPr>
+                  </pic:nvPicPr>
+                  <pic:blipFill>
+                    <a:blip r:embed="rId31"/>
+                    <a:stretch>
+                      <a:fillRect/>
+                    </a:stretch>
+                  </pic:blipFill>
+                  <pic:spPr bwMode="auto">
+                    <a:xfrm>
+                      <a:off x="0" y="0"/>
+                      <a:ext cx="5334000" cy="3333750"/>
+                    </a:xfrm>
+                    <a:prstGeom prst="rect">
+                      <a:avLst/>
+                    </a:prstGeom>
+                    <a:noFill/>
+                    <a:ln w="9525">
+                      <a:noFill/>
+                      <a:headEnd/>
+                      <a:tailEnd/>
+                    </a:ln>
+                  </pic:spPr>
+                </pic:pic>
+              </a:graphicData>
+            </a:graphic>
+          </wp:inline>
+        </w:drawing>
+      </w:r>
+    </w:p>
+    <w:p>
+      <w:pPr>
+        <w:pStyle w:val="BodyText"/>
+      </w:pPr>
+      <w:r>
+        <w:drawing>
+          <wp:inline>
+            <wp:extent cx="5334000" cy="3333750"/>
+            <wp:effectExtent b="0" l="0" r="0" t="0"/>
+            <wp:docPr descr="Figura 7 — Repositorios privados en Amazon ECR: tienda-frontend, tienda-backend y tienda-db." title="" id="35" name="Picture"/>
+            <a:graphic>
+              <a:graphicData uri="http://schemas.openxmlformats.org/drawingml/2006/picture">
+                <pic:pic>
+                  <pic:nvPicPr>
+                    <pic:cNvPr descr="evidencias/ie2-ecr-repos.png" id="36" name="Picture"/>
+                    <pic:cNvPicPr>
+                      <a:picLocks noChangeArrowheads="1" noChangeAspect="1"/>
+                    </pic:cNvPicPr>
+                  </pic:nvPicPr>
+                  <pic:blipFill>
+                    <a:blip r:embed="rId34"/>
+                    <a:stretch>
+                      <a:fillRect/>
+                    </a:stretch>
+                  </pic:blipFill>
+                  <pic:spPr bwMode="auto">
+                    <a:xfrm>
+                      <a:off x="0" y="0"/>
+                      <a:ext cx="5334000" cy="3333750"/>
+                    </a:xfrm>
+                    <a:prstGeom prst="rect">
+                      <a:avLst/>
+                    </a:prstGeom>
+                    <a:noFill/>
+                    <a:ln w="9525">
+                      <a:noFill/>
+                      <a:headEnd/>
+                      <a:tailEnd/>
+                    </a:ln>
+                  </pic:spPr>
+                </pic:pic>
+              </a:graphicData>
+            </a:graphic>
+          </wp:inline>
+        </w:drawing>
       </w:r>
     </w:p>
     <w:p>
@@ -2666,8 +2983,8 @@
         </w:pict>
       </w:r>
     </w:p>
-    <w:bookmarkEnd w:id="16"/>
-    <w:bookmarkStart w:id="17" w:name="Xa33c65c3ad8e4ef478f7bdcc95df0c2579918ad"/>
+    <w:bookmarkEnd w:id="37"/>
+    <w:bookmarkStart w:id="44" w:name="Xa33c65c3ad8e4ef478f7bdcc95df0c2579918ad"/>
     <w:p>
       <w:pPr>
         <w:pStyle w:val="Heading2"/>
@@ -3264,69 +3581,167 @@
           <w:b/>
           <w:bCs/>
         </w:rPr>
-        <w:t xml:space="preserve">Cómo evidenciar el autoscaling (en AWS):</w:t>
-      </w:r>
-      <w:r>
-        <w:t xml:space="preserve"> </w:t>
-      </w:r>
-      <w:r>
-        <w:t xml:space="preserve">generar carga con una herramienta como</w:t>
-      </w:r>
-      <w:r>
-        <w:t xml:space="preserve"> </w:t>
-      </w:r>
-      <w:r>
-        <w:rPr>
-          <w:rStyle w:val="VerbatimChar"/>
-        </w:rPr>
-        <w:t xml:space="preserve">hey</w:t>
-      </w:r>
-      <w:r>
-        <w:t xml:space="preserve"> </w:t>
-      </w:r>
-      <w:r>
-        <w:t xml:space="preserve">o</w:t>
-      </w:r>
-      <w:r>
-        <w:t xml:space="preserve"> </w:t>
-      </w:r>
-      <w:r>
-        <w:rPr>
-          <w:rStyle w:val="VerbatimChar"/>
-        </w:rPr>
-        <w:t xml:space="preserve">ab</w:t>
-      </w:r>
-      <w:r>
-        <w:t xml:space="preserve"> </w:t>
-      </w:r>
-      <w:r>
-        <w:t xml:space="preserve">contra la URL del ALB y observar en CloudWatch cómo sube la CPU y ECS crea tasks</w:t>
-      </w:r>
-      <w:r>
-        <w:t xml:space="preserve"> </w:t>
-      </w:r>
-      <w:r>
-        <w:t xml:space="preserve">adicionales (de 2 a 3/4) hasta estabilizar la CPU cerca del 50%.</w:t>
-      </w:r>
-    </w:p>
-    <w:p>
-      <w:pPr>
-        <w:pStyle w:val="BlockText"/>
-      </w:pPr>
-      <w:r>
-        <w:rPr>
-          <w:rStyle w:val="VerbatimChar"/>
-        </w:rPr>
-        <w:t xml:space="preserve">[INSERTAR CAPTURA: política de autoscaling en la consola ECS (Service → Auto Scaling)]</w:t>
-      </w:r>
-      <w:r>
-        <w:t xml:space="preserve"> </w:t>
-      </w:r>
-      <w:r>
-        <w:rPr>
-          <w:rStyle w:val="VerbatimChar"/>
-        </w:rPr>
-        <w:t xml:space="preserve">[INSERTAR CAPTURA: gráfico de CPU en CloudWatch + recuento de tasks subiendo durante la prueba de carga]</w:t>
+        <w:t xml:space="preserve">Evidencia:</w:t>
+      </w:r>
+      <w:r>
+        <w:t xml:space="preserve"> </w:t>
+      </w:r>
+      <w:r>
+        <w:t xml:space="preserve">la consola muestra la</w:t>
+      </w:r>
+      <w:r>
+        <w:t xml:space="preserve"> </w:t>
+      </w:r>
+      <w:r>
+        <w:rPr>
+          <w:b/>
+          <w:bCs/>
+        </w:rPr>
+        <w:t xml:space="preserve">política de escalado</w:t>
+      </w:r>
+      <w:r>
+        <w:t xml:space="preserve"> </w:t>
+      </w:r>
+      <w:r>
+        <w:t xml:space="preserve">registrada en el servicio y sus</w:t>
+      </w:r>
+      <w:r>
+        <w:t xml:space="preserve"> </w:t>
+      </w:r>
+      <w:r>
+        <w:rPr>
+          <w:b/>
+          <w:bCs/>
+        </w:rPr>
+        <w:t xml:space="preserve">actividades de escalado</w:t>
+      </w:r>
+      <w:r>
+        <w:t xml:space="preserve"> </w:t>
+      </w:r>
+      <w:r>
+        <w:t xml:space="preserve">(Figura 8); CloudWatch grafica la métrica de</w:t>
+      </w:r>
+      <w:r>
+        <w:t xml:space="preserve"> </w:t>
+      </w:r>
+      <w:r>
+        <w:rPr>
+          <w:b/>
+          <w:bCs/>
+        </w:rPr>
+        <w:t xml:space="preserve">CPUUtilization</w:t>
+      </w:r>
+      <w:r>
+        <w:t xml:space="preserve"> </w:t>
+      </w:r>
+      <w:r>
+        <w:t xml:space="preserve">que</w:t>
+      </w:r>
+      <w:r>
+        <w:t xml:space="preserve"> </w:t>
+      </w:r>
+      <w:r>
+        <w:t xml:space="preserve">dispara el escalado (Figura 9). Bajo carga sostenida, ECS crea tasks adicionales (de 2 hacia 4)</w:t>
+      </w:r>
+      <w:r>
+        <w:t xml:space="preserve"> </w:t>
+      </w:r>
+      <w:r>
+        <w:t xml:space="preserve">hasta devolver la CPU promedio cerca del objetivo de 50%.</w:t>
+      </w:r>
+    </w:p>
+    <w:p>
+      <w:pPr>
+        <w:pStyle w:val="BodyText"/>
+      </w:pPr>
+      <w:r>
+        <w:drawing>
+          <wp:inline>
+            <wp:extent cx="5334000" cy="3333750"/>
+            <wp:effectExtent b="0" l="0" r="0" t="0"/>
+            <wp:docPr descr="Figura 8 — Servicio backend → Escalamiento automático: política de Target Tracking (CPU 50%) y registro de actividades de escalado." title="" id="39" name="Picture"/>
+            <a:graphic>
+              <a:graphicData uri="http://schemas.openxmlformats.org/drawingml/2006/picture">
+                <pic:pic>
+                  <pic:nvPicPr>
+                    <pic:cNvPr descr="evidencias/ie3-autoscaling.png" id="40" name="Picture"/>
+                    <pic:cNvPicPr>
+                      <a:picLocks noChangeArrowheads="1" noChangeAspect="1"/>
+                    </pic:cNvPicPr>
+                  </pic:nvPicPr>
+                  <pic:blipFill>
+                    <a:blip r:embed="rId38"/>
+                    <a:stretch>
+                      <a:fillRect/>
+                    </a:stretch>
+                  </pic:blipFill>
+                  <pic:spPr bwMode="auto">
+                    <a:xfrm>
+                      <a:off x="0" y="0"/>
+                      <a:ext cx="5334000" cy="3333750"/>
+                    </a:xfrm>
+                    <a:prstGeom prst="rect">
+                      <a:avLst/>
+                    </a:prstGeom>
+                    <a:noFill/>
+                    <a:ln w="9525">
+                      <a:noFill/>
+                      <a:headEnd/>
+                      <a:tailEnd/>
+                    </a:ln>
+                  </pic:spPr>
+                </pic:pic>
+              </a:graphicData>
+            </a:graphic>
+          </wp:inline>
+        </w:drawing>
+      </w:r>
+    </w:p>
+    <w:p>
+      <w:pPr>
+        <w:pStyle w:val="BodyText"/>
+      </w:pPr>
+      <w:r>
+        <w:drawing>
+          <wp:inline>
+            <wp:extent cx="5334000" cy="3333750"/>
+            <wp:effectExtent b="0" l="0" r="0" t="0"/>
+            <wp:docPr descr="Figura 9 — CloudWatch → Métricas: utilización de CPU (CPUUtilization) del servicio en el tiempo." title="" id="42" name="Picture"/>
+            <a:graphic>
+              <a:graphicData uri="http://schemas.openxmlformats.org/drawingml/2006/picture">
+                <pic:pic>
+                  <pic:nvPicPr>
+                    <pic:cNvPr descr="evidencias/ie3-cpu-metric.png" id="43" name="Picture"/>
+                    <pic:cNvPicPr>
+                      <a:picLocks noChangeArrowheads="1" noChangeAspect="1"/>
+                    </pic:cNvPicPr>
+                  </pic:nvPicPr>
+                  <pic:blipFill>
+                    <a:blip r:embed="rId41"/>
+                    <a:stretch>
+                      <a:fillRect/>
+                    </a:stretch>
+                  </pic:blipFill>
+                  <pic:spPr bwMode="auto">
+                    <a:xfrm>
+                      <a:off x="0" y="0"/>
+                      <a:ext cx="5334000" cy="3333750"/>
+                    </a:xfrm>
+                    <a:prstGeom prst="rect">
+                      <a:avLst/>
+                    </a:prstGeom>
+                    <a:noFill/>
+                    <a:ln w="9525">
+                      <a:noFill/>
+                      <a:headEnd/>
+                      <a:tailEnd/>
+                    </a:ln>
+                  </pic:spPr>
+                </pic:pic>
+              </a:graphicData>
+            </a:graphic>
+          </wp:inline>
+        </w:drawing>
       </w:r>
     </w:p>
     <w:p>
@@ -3336,8 +3751,8 @@
         </w:pict>
       </w:r>
     </w:p>
-    <w:bookmarkEnd w:id="17"/>
-    <w:bookmarkStart w:id="18" w:name="Xa5c711c451892c7c7d882308789434b5c6753d0"/>
+    <w:bookmarkEnd w:id="44"/>
+    <w:bookmarkStart w:id="48" w:name="Xa5c711c451892c7c7d882308789434b5c6753d0"/>
     <w:p>
       <w:pPr>
         <w:pStyle w:val="Heading2"/>
@@ -3734,18 +4149,54 @@
         <w:t xml:space="preserve"> </w:t>
       </w:r>
       <w:r>
-        <w:t xml:space="preserve">falla (ver §9, run #3).</w:t>
-      </w:r>
-    </w:p>
-    <w:p>
-      <w:pPr>
-        <w:pStyle w:val="BlockText"/>
-      </w:pPr>
-      <w:r>
-        <w:rPr>
-          <w:rStyle w:val="VerbatimChar"/>
-        </w:rPr>
-        <w:t xml:space="preserve">[INSERTAR CAPTURA: pestaña Actions de GitHub con el run en verde (build-and-deploy success)]</w:t>
+        <w:t xml:space="preserve">falla (ver §8.3).</w:t>
+      </w:r>
+    </w:p>
+    <w:p>
+      <w:pPr>
+        <w:pStyle w:val="BodyText"/>
+      </w:pPr>
+      <w:r>
+        <w:drawing>
+          <wp:inline>
+            <wp:extent cx="5334000" cy="3333750"/>
+            <wp:effectExtent b="0" l="0" r="0" t="0"/>
+            <wp:docPr descr="Figura 10 — GitHub Actions: ejecución del pipeline completa y exitosa (build → push a ECR → deploy a ECS de backend y frontend)." title="" id="46" name="Picture"/>
+            <a:graphic>
+              <a:graphicData uri="http://schemas.openxmlformats.org/drawingml/2006/picture">
+                <pic:pic>
+                  <pic:nvPicPr>
+                    <pic:cNvPr descr="evidencias/ie4-pipeline-verde.png" id="47" name="Picture"/>
+                    <pic:cNvPicPr>
+                      <a:picLocks noChangeArrowheads="1" noChangeAspect="1"/>
+                    </pic:cNvPicPr>
+                  </pic:nvPicPr>
+                  <pic:blipFill>
+                    <a:blip r:embed="rId45"/>
+                    <a:stretch>
+                      <a:fillRect/>
+                    </a:stretch>
+                  </pic:blipFill>
+                  <pic:spPr bwMode="auto">
+                    <a:xfrm>
+                      <a:off x="0" y="0"/>
+                      <a:ext cx="5334000" cy="3333750"/>
+                    </a:xfrm>
+                    <a:prstGeom prst="rect">
+                      <a:avLst/>
+                    </a:prstGeom>
+                    <a:noFill/>
+                    <a:ln w="9525">
+                      <a:noFill/>
+                      <a:headEnd/>
+                      <a:tailEnd/>
+                    </a:ln>
+                  </pic:spPr>
+                </pic:pic>
+              </a:graphicData>
+            </a:graphic>
+          </wp:inline>
+        </w:drawing>
       </w:r>
     </w:p>
     <w:p>
@@ -3755,8 +4206,8 @@
         </w:pict>
       </w:r>
     </w:p>
-    <w:bookmarkEnd w:id="18"/>
-    <w:bookmarkStart w:id="19" w:name="X575a9e8826d7f8ac79fcbb612ef30c6d31738b8"/>
+    <w:bookmarkEnd w:id="48"/>
+    <w:bookmarkStart w:id="55" w:name="X575a9e8826d7f8ac79fcbb612ef30c6d31738b8"/>
     <w:p>
       <w:pPr>
         <w:pStyle w:val="Heading2"/>
@@ -4098,14 +4549,108 @@
       </w:r>
     </w:p>
     <w:p>
+      <w:pPr>
+        <w:pStyle w:val="BodyText"/>
+      </w:pPr>
+      <w:r>
+        <w:drawing>
+          <wp:inline>
+            <wp:extent cx="5334000" cy="3333750"/>
+            <wp:effectExtent b="0" l="0" r="0" t="0"/>
+            <wp:docPr descr="Figura 11 — AWS Systems Manager → Parameter Store: parámetro /tienda/db_password de tipo SecureString (contraseña cifrada, fuera del repositorio)." title="" id="50" name="Picture"/>
+            <a:graphic>
+              <a:graphicData uri="http://schemas.openxmlformats.org/drawingml/2006/picture">
+                <pic:pic>
+                  <pic:nvPicPr>
+                    <pic:cNvPr descr="evidencias/ie5-ssm.png" id="51" name="Picture"/>
+                    <pic:cNvPicPr>
+                      <a:picLocks noChangeArrowheads="1" noChangeAspect="1"/>
+                    </pic:cNvPicPr>
+                  </pic:nvPicPr>
+                  <pic:blipFill>
+                    <a:blip r:embed="rId49"/>
+                    <a:stretch>
+                      <a:fillRect/>
+                    </a:stretch>
+                  </pic:blipFill>
+                  <pic:spPr bwMode="auto">
+                    <a:xfrm>
+                      <a:off x="0" y="0"/>
+                      <a:ext cx="5334000" cy="3333750"/>
+                    </a:xfrm>
+                    <a:prstGeom prst="rect">
+                      <a:avLst/>
+                    </a:prstGeom>
+                    <a:noFill/>
+                    <a:ln w="9525">
+                      <a:noFill/>
+                      <a:headEnd/>
+                      <a:tailEnd/>
+                    </a:ln>
+                  </pic:spPr>
+                </pic:pic>
+              </a:graphicData>
+            </a:graphic>
+          </wp:inline>
+        </w:drawing>
+      </w:r>
+    </w:p>
+    <w:p>
+      <w:pPr>
+        <w:pStyle w:val="BodyText"/>
+      </w:pPr>
+      <w:r>
+        <w:drawing>
+          <wp:inline>
+            <wp:extent cx="5334000" cy="3333750"/>
+            <wp:effectExtent b="0" l="0" r="0" t="0"/>
+            <wp:docPr descr="Figura 12 — GitHub → Settings → Secrets and variables → Actions: credenciales de AWS almacenadas como repository secrets." title="" id="53" name="Picture"/>
+            <a:graphic>
+              <a:graphicData uri="http://schemas.openxmlformats.org/drawingml/2006/picture">
+                <pic:pic>
+                  <pic:nvPicPr>
+                    <pic:cNvPr descr="evidencias/ie5-github-secrets.png" id="54" name="Picture"/>
+                    <pic:cNvPicPr>
+                      <a:picLocks noChangeArrowheads="1" noChangeAspect="1"/>
+                    </pic:cNvPicPr>
+                  </pic:nvPicPr>
+                  <pic:blipFill>
+                    <a:blip r:embed="rId52"/>
+                    <a:stretch>
+                      <a:fillRect/>
+                    </a:stretch>
+                  </pic:blipFill>
+                  <pic:spPr bwMode="auto">
+                    <a:xfrm>
+                      <a:off x="0" y="0"/>
+                      <a:ext cx="5334000" cy="3333750"/>
+                    </a:xfrm>
+                    <a:prstGeom prst="rect">
+                      <a:avLst/>
+                    </a:prstGeom>
+                    <a:noFill/>
+                    <a:ln w="9525">
+                      <a:noFill/>
+                      <a:headEnd/>
+                      <a:tailEnd/>
+                    </a:ln>
+                  </pic:spPr>
+                </pic:pic>
+              </a:graphicData>
+            </a:graphic>
+          </wp:inline>
+        </w:drawing>
+      </w:r>
+    </w:p>
+    <w:p>
       <w:r>
         <w:pict>
           <v:rect style="width:0;height:1.5pt" o:hralign="center" o:hrstd="t" o:hr="t"/>
         </w:pict>
       </w:r>
     </w:p>
-    <w:bookmarkEnd w:id="19"/>
-    <w:bookmarkStart w:id="24" w:name="Xe2826dea6c7caef8a2375ee3f5a72ac4b0955e5"/>
+    <w:bookmarkEnd w:id="55"/>
+    <w:bookmarkStart w:id="63" w:name="Xe2826dea6c7caef8a2375ee3f5a72ac4b0955e5"/>
     <w:p>
       <w:pPr>
         <w:pStyle w:val="Heading2"/>
@@ -4114,7 +4659,7 @@
         <w:t xml:space="preserve">8. Análisis de logs, métricas y tiempos del pipeline (IE6)</w:t>
       </w:r>
     </w:p>
-    <w:bookmarkStart w:id="20" w:name="Xacccac71e09ff458c37af5dc94d4c73f67fcc47"/>
+    <w:bookmarkStart w:id="59" w:name="Xacccac71e09ff458c37af5dc94d4c73f67fcc47"/>
     <w:p>
       <w:pPr>
         <w:pStyle w:val="Heading3"/>
@@ -4213,17 +4758,53 @@
     </w:p>
     <w:p>
       <w:pPr>
-        <w:pStyle w:val="BlockText"/>
-      </w:pPr>
-      <w:r>
-        <w:rPr>
-          <w:rStyle w:val="VerbatimChar"/>
-        </w:rPr>
-        <w:t xml:space="preserve">[INSERTAR CAPTURA: CloudWatch Logs → /ecs/tienda-backend mostrando "Pool de conexiones MySQL inicializado" y peticiones a /api/productos]</w:t>
-      </w:r>
-    </w:p>
-    <w:bookmarkEnd w:id="20"/>
-    <w:bookmarkStart w:id="21" w:name="X46ff0776abd2faba92aea3df7f6b86b5d6532be"/>
+        <w:pStyle w:val="BodyText"/>
+      </w:pPr>
+      <w:r>
+        <w:drawing>
+          <wp:inline>
+            <wp:extent cx="5334000" cy="3333750"/>
+            <wp:effectExtent b="0" l="0" r="0" t="0"/>
+            <wp:docPr descr="Figura 13 — CloudWatch Logs del backend: el contenedor inicializa el pool de conexiones MySQL y queda escuchando en el puerto 3001." title="" id="57" name="Picture"/>
+            <a:graphic>
+              <a:graphicData uri="http://schemas.openxmlformats.org/drawingml/2006/picture">
+                <pic:pic>
+                  <pic:nvPicPr>
+                    <pic:cNvPr descr="evidencias/ie6-cloudwatch-logs.png" id="58" name="Picture"/>
+                    <pic:cNvPicPr>
+                      <a:picLocks noChangeArrowheads="1" noChangeAspect="1"/>
+                    </pic:cNvPicPr>
+                  </pic:nvPicPr>
+                  <pic:blipFill>
+                    <a:blip r:embed="rId56"/>
+                    <a:stretch>
+                      <a:fillRect/>
+                    </a:stretch>
+                  </pic:blipFill>
+                  <pic:spPr bwMode="auto">
+                    <a:xfrm>
+                      <a:off x="0" y="0"/>
+                      <a:ext cx="5334000" cy="3333750"/>
+                    </a:xfrm>
+                    <a:prstGeom prst="rect">
+                      <a:avLst/>
+                    </a:prstGeom>
+                    <a:noFill/>
+                    <a:ln w="9525">
+                      <a:noFill/>
+                      <a:headEnd/>
+                      <a:tailEnd/>
+                    </a:ln>
+                  </pic:spPr>
+                </pic:pic>
+              </a:graphicData>
+            </a:graphic>
+          </wp:inline>
+        </w:drawing>
+      </w:r>
+    </w:p>
+    <w:bookmarkEnd w:id="59"/>
+    <w:bookmarkStart w:id="60" w:name="X46ff0776abd2faba92aea3df7f6b86b5d6532be"/>
     <w:p>
       <w:pPr>
         <w:pStyle w:val="Heading3"/>
@@ -4253,7 +4834,7 @@
         <w:t xml:space="preserve"> </w:t>
       </w:r>
       <w:r>
-        <w:t xml:space="preserve">del workflow el 18-06-2026:</w:t>
+        <w:t xml:space="preserve">del workflow durante la integración del pipeline:</w:t>
       </w:r>
     </w:p>
     <w:tbl>
@@ -4706,8 +5287,8 @@
         <w:t xml:space="preserve">(backend y frontend) y coincidió con otra ejecución en curso.</w:t>
       </w:r>
     </w:p>
-    <w:bookmarkEnd w:id="21"/>
-    <w:bookmarkStart w:id="22" w:name="X0bc19e1b22b535ffb1a970e0aeccd8acab39308"/>
+    <w:bookmarkEnd w:id="60"/>
+    <w:bookmarkStart w:id="61" w:name="X0bc19e1b22b535ffb1a970e0aeccd8acab39308"/>
     <w:p>
       <w:pPr>
         <w:pStyle w:val="Heading3"/>
@@ -5022,11 +5603,11 @@
         <w:t xml:space="preserve">estable y en verde</w:t>
       </w:r>
       <w:r>
-        <w:t xml:space="preserve">).</w:t>
-      </w:r>
-    </w:p>
-    <w:bookmarkEnd w:id="22"/>
-    <w:bookmarkStart w:id="23" w:name="X164a52664c04dad42c1501e810d8e74b399bb4e"/>
+        <w:t xml:space="preserve">, ver Figura 10).</w:t>
+      </w:r>
+    </w:p>
+    <w:bookmarkEnd w:id="61"/>
+    <w:bookmarkStart w:id="62" w:name="X164a52664c04dad42c1501e810d8e74b399bb4e"/>
     <w:p>
       <w:pPr>
         <w:pStyle w:val="Heading3"/>
@@ -5185,9 +5766,9 @@
         </w:pict>
       </w:r>
     </w:p>
-    <w:bookmarkEnd w:id="23"/>
-    <w:bookmarkEnd w:id="24"/>
-    <w:bookmarkStart w:id="25" w:name="X3abcadfb9a7aa7efeb3468fb19b6e802231bcc0"/>
+    <w:bookmarkEnd w:id="62"/>
+    <w:bookmarkEnd w:id="63"/>
+    <w:bookmarkStart w:id="67" w:name="X3abcadfb9a7aa7efeb3468fb19b6e802231bcc0"/>
     <w:p>
       <w:pPr>
         <w:pStyle w:val="Heading2"/>
@@ -5466,7 +6047,7 @@
           <w:b/>
           <w:bCs/>
         </w:rPr>
-        <w:t xml:space="preserve">Pruebas a realizar (con el lab encendido):</w:t>
+        <w:t xml:space="preserve">Validación realizada:</w:t>
       </w:r>
     </w:p>
     <w:p>
@@ -5478,7 +6059,23 @@
         </w:numPr>
       </w:pPr>
       <w:r>
-        <w:t xml:space="preserve">Abrir la URL del ALB → la página carga (frontend operativo).</w:t>
+        <w:t xml:space="preserve">La página carga desde la URL del ALB →</w:t>
+      </w:r>
+      <w:r>
+        <w:t xml:space="preserve"> </w:t>
+      </w:r>
+      <w:r>
+        <w:rPr>
+          <w:b/>
+          <w:bCs/>
+        </w:rPr>
+        <w:t xml:space="preserve">frontend operativo</w:t>
+      </w:r>
+      <w:r>
+        <w:t xml:space="preserve"> </w:t>
+      </w:r>
+      <w:r>
+        <w:t xml:space="preserve">(Figura 4).</w:t>
       </w:r>
     </w:p>
     <w:p>
@@ -5490,12 +6087,6 @@
         </w:numPr>
       </w:pPr>
       <w:r>
-        <w:t xml:space="preserve">Botón</w:t>
-      </w:r>
-      <w:r>
-        <w:t xml:space="preserve"> </w:t>
-      </w:r>
-      <w:r>
         <w:rPr>
           <w:i/>
           <w:iCs/>
@@ -5506,7 +6097,23 @@
         <w:t xml:space="preserve"> </w:t>
       </w:r>
       <w:r>
-        <w:t xml:space="preserve">→ se listan los productos (Front → Back → BD operativo).</w:t>
+        <w:t xml:space="preserve">lista los registros →</w:t>
+      </w:r>
+      <w:r>
+        <w:t xml:space="preserve"> </w:t>
+      </w:r>
+      <w:r>
+        <w:rPr>
+          <w:b/>
+          <w:bCs/>
+        </w:rPr>
+        <w:t xml:space="preserve">Front → Back → BD operativo</w:t>
+      </w:r>
+      <w:r>
+        <w:t xml:space="preserve"> </w:t>
+      </w:r>
+      <w:r>
+        <w:t xml:space="preserve">(Figura 4).</w:t>
       </w:r>
     </w:p>
     <w:p>
@@ -5518,28 +6125,23 @@
         </w:numPr>
       </w:pPr>
       <w:r>
-        <w:rPr>
-          <w:rStyle w:val="VerbatimChar"/>
-        </w:rPr>
-        <w:t xml:space="preserve">curl http://&lt;ALB&gt;/api/health</w:t>
-      </w:r>
-      <w:r>
-        <w:t xml:space="preserve"> </w:t>
-      </w:r>
-      <w:r>
-        <w:t xml:space="preserve">→ responde</w:t>
-      </w:r>
-      <w:r>
-        <w:t xml:space="preserve"> </w:t>
-      </w:r>
-      <w:r>
-        <w:rPr>
-          <w:rStyle w:val="VerbatimChar"/>
-        </w:rPr>
-        <w:t xml:space="preserve">{"status":"ok"}</w:t>
-      </w:r>
-      <w:r>
-        <w:t xml:space="preserve">.</w:t>
+        <w:t xml:space="preserve">Operaciones</w:t>
+      </w:r>
+      <w:r>
+        <w:t xml:space="preserve"> </w:t>
+      </w:r>
+      <w:r>
+        <w:rPr>
+          <w:b/>
+          <w:bCs/>
+        </w:rPr>
+        <w:t xml:space="preserve">CRUD</w:t>
+      </w:r>
+      <w:r>
+        <w:t xml:space="preserve"> </w:t>
+      </w:r>
+      <w:r>
+        <w:t xml:space="preserve">(crear / editar / eliminar) reflejadas en la tabla y persistidas en MySQL.</w:t>
       </w:r>
     </w:p>
     <w:p>
@@ -5551,7 +6153,45 @@
         </w:numPr>
       </w:pPr>
       <w:r>
-        <w:t xml:space="preserve">Crear / editar / eliminar un producto → cambios persistidos en MySQL.</w:t>
+        <w:t xml:space="preserve">Los</w:t>
+      </w:r>
+      <w:r>
+        <w:t xml:space="preserve"> </w:t>
+      </w:r>
+      <w:r>
+        <w:rPr>
+          <w:b/>
+          <w:bCs/>
+        </w:rPr>
+        <w:t xml:space="preserve">eventos del servicio</w:t>
+      </w:r>
+      <w:r>
+        <w:t xml:space="preserve"> </w:t>
+      </w:r>
+      <w:r>
+        <w:t xml:space="preserve">muestran el despliegue alcanzando</w:t>
+      </w:r>
+      <w:r>
+        <w:t xml:space="preserve"> </w:t>
+      </w:r>
+      <w:r>
+        <w:rPr>
+          <w:i/>
+          <w:iCs/>
+        </w:rPr>
+        <w:t xml:space="preserve">steady state</w:t>
+      </w:r>
+      <w:r>
+        <w:t xml:space="preserve"> </w:t>
+      </w:r>
+      <w:r>
+        <w:t xml:space="preserve">y el registro de</w:t>
+      </w:r>
+      <w:r>
+        <w:t xml:space="preserve"> </w:t>
+      </w:r>
+      <w:r>
+        <w:t xml:space="preserve">destinos en el balanceador (Figura 14).</w:t>
       </w:r>
     </w:p>
     <w:p>
@@ -5570,13 +6210,7 @@
         <w:t xml:space="preserve">Autorecuperación</w:t>
       </w:r>
       <w:r>
-        <w:t xml:space="preserve">: detener manualmente una task del backend → ECS levanta una nueva para</w:t>
-      </w:r>
-      <w:r>
-        <w:t xml:space="preserve"> </w:t>
-      </w:r>
-      <w:r>
-        <w:t xml:space="preserve">mantener</w:t>
+        <w:t xml:space="preserve">: si una task muere, ECS levanta otra para mantener el</w:t>
       </w:r>
       <w:r>
         <w:t xml:space="preserve"> </w:t>
@@ -5591,27 +6225,54 @@
         <w:t xml:space="preserve"> </w:t>
       </w:r>
       <w:r>
-        <w:t xml:space="preserve">(verificable en la consola y en los eventos del servicio).</w:t>
-      </w:r>
-    </w:p>
-    <w:p>
-      <w:pPr>
-        <w:pStyle w:val="BlockText"/>
-      </w:pPr>
-      <w:r>
-        <w:rPr>
-          <w:rStyle w:val="VerbatimChar"/>
-        </w:rPr>
-        <w:t xml:space="preserve">[INSERTAR CAPTURA: respuesta de /api/health]</w:t>
-      </w:r>
-      <w:r>
-        <w:t xml:space="preserve"> </w:t>
-      </w:r>
-      <w:r>
-        <w:rPr>
-          <w:rStyle w:val="VerbatimChar"/>
-        </w:rPr>
-        <w:t xml:space="preserve">[INSERTAR CAPTURA: eventos del servicio ECS mostrando una task reemplazada (autorecuperación)]</w:t>
+        <w:t xml:space="preserve">(mismo mecanismo que repone el servicio tras un redeploy).</w:t>
+      </w:r>
+    </w:p>
+    <w:p>
+      <w:pPr>
+        <w:pStyle w:val="FirstParagraph"/>
+      </w:pPr>
+      <w:r>
+        <w:drawing>
+          <wp:inline>
+            <wp:extent cx="5334000" cy="3333750"/>
+            <wp:effectExtent b="0" l="0" r="0" t="0"/>
+            <wp:docPr descr="Figura 14 — Eventos del servicio tienda-backend: despliegues alcanzando steady state y registro/baja de destinos en el balanceador." title="" id="65" name="Picture"/>
+            <a:graphic>
+              <a:graphicData uri="http://schemas.openxmlformats.org/drawingml/2006/picture">
+                <pic:pic>
+                  <pic:nvPicPr>
+                    <pic:cNvPr descr="evidencias/ie7-eventos-steady.png" id="66" name="Picture"/>
+                    <pic:cNvPicPr>
+                      <a:picLocks noChangeArrowheads="1" noChangeAspect="1"/>
+                    </pic:cNvPicPr>
+                  </pic:nvPicPr>
+                  <pic:blipFill>
+                    <a:blip r:embed="rId64"/>
+                    <a:stretch>
+                      <a:fillRect/>
+                    </a:stretch>
+                  </pic:blipFill>
+                  <pic:spPr bwMode="auto">
+                    <a:xfrm>
+                      <a:off x="0" y="0"/>
+                      <a:ext cx="5334000" cy="3333750"/>
+                    </a:xfrm>
+                    <a:prstGeom prst="rect">
+                      <a:avLst/>
+                    </a:prstGeom>
+                    <a:noFill/>
+                    <a:ln w="9525">
+                      <a:noFill/>
+                      <a:headEnd/>
+                      <a:tailEnd/>
+                    </a:ln>
+                  </pic:spPr>
+                </pic:pic>
+              </a:graphicData>
+            </a:graphic>
+          </wp:inline>
+        </w:drawing>
       </w:r>
     </w:p>
     <w:p>
@@ -5621,8 +6282,8 @@
         </w:pict>
       </w:r>
     </w:p>
-    <w:bookmarkEnd w:id="25"/>
-    <w:bookmarkStart w:id="26" w:name="X49435a1c0200288cb46053ed6b96940b81e3f96"/>
+    <w:bookmarkEnd w:id="67"/>
+    <w:bookmarkStart w:id="68" w:name="X49435a1c0200288cb46053ed6b96940b81e3f96"/>
     <w:p>
       <w:pPr>
         <w:pStyle w:val="Heading2"/>
@@ -5970,27 +6631,33 @@
               </w:rPr>
               <w:t xml:space="preserve">ExpiredToken</w:t>
             </w:r>
-          </w:p>
-        </w:tc>
-        <w:tc>
-          <w:tcPr/>
-          <w:p>
-            <w:pPr>
-              <w:pStyle w:val="Compact"/>
-            </w:pPr>
-            <w:r>
-              <w:t xml:space="preserve">Sesión del Learner Lab caducó</w:t>
-            </w:r>
-          </w:p>
-        </w:tc>
-        <w:tc>
-          <w:tcPr/>
-          <w:p>
-            <w:pPr>
-              <w:pStyle w:val="Compact"/>
-            </w:pPr>
-            <w:r>
-              <w:t xml:space="preserve">Pegar credenciales nuevas y actualizar secrets</w:t>
+            <w:r>
+              <w:t xml:space="preserve"> </w:t>
+            </w:r>
+            <w:r>
+              <w:t xml:space="preserve">/ créditos del lab agotados</w:t>
+            </w:r>
+          </w:p>
+        </w:tc>
+        <w:tc>
+          <w:tcPr/>
+          <w:p>
+            <w:pPr>
+              <w:pStyle w:val="Compact"/>
+            </w:pPr>
+            <w:r>
+              <w:t xml:space="preserve">Sesión del Learner Lab caducó o sin presupuesto</w:t>
+            </w:r>
+          </w:p>
+        </w:tc>
+        <w:tc>
+          <w:tcPr/>
+          <w:p>
+            <w:pPr>
+              <w:pStyle w:val="Compact"/>
+            </w:pPr>
+            <w:r>
+              <w:t xml:space="preserve">Pegar credenciales nuevas; continuar en otra cuenta de Learner Lab disponible</w:t>
             </w:r>
           </w:p>
         </w:tc>
@@ -6003,8 +6670,8 @@
         </w:pict>
       </w:r>
     </w:p>
-    <w:bookmarkEnd w:id="26"/>
-    <w:bookmarkStart w:id="27" w:name="X24d5c80966c6c8b5042f5a2d6697e78c3682bbc"/>
+    <w:bookmarkEnd w:id="68"/>
+    <w:bookmarkStart w:id="69" w:name="X24d5c80966c6c8b5042f5a2d6697e78c3682bbc"/>
     <w:p>
       <w:pPr>
         <w:pStyle w:val="Heading2"/>
@@ -6292,41 +6959,14 @@
         </w:pict>
       </w:r>
     </w:p>
-    <w:bookmarkEnd w:id="27"/>
-    <w:bookmarkStart w:id="28" w:name="X6534bd8aab2f6292929cb465020f684755d5dbe"/>
+    <w:bookmarkEnd w:id="69"/>
+    <w:bookmarkStart w:id="70" w:name="anexo-a--checklist-de-evidencias-estado"/>
     <w:p>
       <w:pPr>
         <w:pStyle w:val="Heading2"/>
       </w:pPr>
       <w:r>
-        <w:t xml:space="preserve">Anexo A — Checklist de evidencias a capturar en AWS Academy</w:t>
-      </w:r>
-    </w:p>
-    <w:p>
-      <w:pPr>
-        <w:pStyle w:val="BlockText"/>
-      </w:pPr>
-      <w:r>
-        <w:t xml:space="preserve">Requiere el laboratorio</w:t>
-      </w:r>
-      <w:r>
-        <w:t xml:space="preserve"> </w:t>
-      </w:r>
-      <w:r>
-        <w:rPr>
-          <w:b/>
-          <w:bCs/>
-        </w:rPr>
-        <w:t xml:space="preserve">encendido</w:t>
-      </w:r>
-      <w:r>
-        <w:t xml:space="preserve">. Si los recursos fueron eliminados, primero redesplegar</w:t>
-      </w:r>
-      <w:r>
-        <w:t xml:space="preserve"> </w:t>
-      </w:r>
-      <w:r>
-        <w:t xml:space="preserve">(ver README §4 y el pipeline).</w:t>
+        <w:t xml:space="preserve">Anexo A — Checklist de evidencias (estado)</w:t>
       </w:r>
     </w:p>
     <w:p>
@@ -6353,34 +6993,7 @@
         <w:t xml:space="preserve"> </w:t>
       </w:r>
       <w:r>
-        <w:t xml:space="preserve">con los 3 servicios</w:t>
-      </w:r>
-      <w:r>
-        <w:t xml:space="preserve"> </w:t>
-      </w:r>
-      <w:r>
-        <w:rPr>
-          <w:rStyle w:val="VerbatimChar"/>
-        </w:rPr>
-        <w:t xml:space="preserve">ACTIVE</w:t>
-      </w:r>
-      <w:r>
-        <w:t xml:space="preserve"> </w:t>
-      </w:r>
-      <w:r>
-        <w:t xml:space="preserve">y tasks</w:t>
-      </w:r>
-      <w:r>
-        <w:t xml:space="preserve"> </w:t>
-      </w:r>
-      <w:r>
-        <w:rPr>
-          <w:rStyle w:val="VerbatimChar"/>
-        </w:rPr>
-        <w:t xml:space="preserve">RUNNING</w:t>
-      </w:r>
-      <w:r>
-        <w:t xml:space="preserve">.</w:t>
+        <w:t xml:space="preserve">con los 3 servicios activos (Figura 1).</w:t>
       </w:r>
     </w:p>
     <w:p>
@@ -6419,7 +7032,10 @@
         <w:t xml:space="preserve">tienda-ecs-sg</w:t>
       </w:r>
       <w:r>
-        <w:t xml:space="preserve">.</w:t>
+        <w:t xml:space="preserve"> </w:t>
+      </w:r>
+      <w:r>
+        <w:t xml:space="preserve">(Figuras 2 y 3).</w:t>
       </w:r>
     </w:p>
     <w:p>
@@ -6431,50 +7047,17 @@
         </w:numPr>
       </w:pPr>
       <w:r>
-        <w:t xml:space="preserve">Target groups</w:t>
-      </w:r>
-      <w:r>
-        <w:t xml:space="preserve"> </w:t>
-      </w:r>
-      <w:r>
-        <w:rPr>
-          <w:rStyle w:val="VerbatimChar"/>
-        </w:rPr>
-        <w:t xml:space="preserve">tg-frontend</w:t>
-      </w:r>
-      <w:r>
-        <w:t xml:space="preserve"> </w:t>
-      </w:r>
-      <w:r>
-        <w:t xml:space="preserve">/</w:t>
-      </w:r>
-      <w:r>
-        <w:t xml:space="preserve"> </w:t>
-      </w:r>
-      <w:r>
-        <w:rPr>
-          <w:rStyle w:val="VerbatimChar"/>
-        </w:rPr>
-        <w:t xml:space="preserve">tg-backend</w:t>
-      </w:r>
-      <w:r>
-        <w:t xml:space="preserve"> </w:t>
-      </w:r>
-      <w:r>
-        <w:t xml:space="preserve">en estado</w:t>
-      </w:r>
-      <w:r>
-        <w:t xml:space="preserve"> </w:t>
-      </w:r>
-      <w:r>
-        <w:rPr>
-          <w:b/>
-          <w:bCs/>
-        </w:rPr>
-        <w:t xml:space="preserve">healthy</w:t>
-      </w:r>
-      <w:r>
-        <w:t xml:space="preserve">.</w:t>
+        <w:rPr>
+          <w:i/>
+          <w:iCs/>
+        </w:rPr>
+        <w:t xml:space="preserve">Target group</w:t>
+      </w:r>
+      <w:r>
+        <w:t xml:space="preserve"> </w:t>
+      </w:r>
+      <w:r>
+        <w:t xml:space="preserve">del backend con destinos registrados (Figura 6).</w:t>
       </w:r>
     </w:p>
     <w:p>
@@ -6486,7 +7069,7 @@
         </w:numPr>
       </w:pPr>
       <w:r>
-        <w:t xml:space="preserve">App en el navegador (URL del ALB) con la tabla de productos cargada.</w:t>
+        <w:t xml:space="preserve">App en el navegador (URL del ALB) con la tabla de productos cargada (Figura 4).</w:t>
       </w:r>
     </w:p>
     <w:p>
@@ -6498,7 +7081,7 @@
         </w:numPr>
       </w:pPr>
       <w:r>
-        <w:t xml:space="preserve">Operación CRUD: crear/editar/eliminar un producto.</w:t>
+        <w:t xml:space="preserve">Operación CRUD sobre productos (Figura 4 / demostrada en el video del proceso).</w:t>
       </w:r>
     </w:p>
     <w:p>
@@ -6510,19 +7093,7 @@
         </w:numPr>
       </w:pPr>
       <w:r>
-        <w:t xml:space="preserve">Respuesta de</w:t>
-      </w:r>
-      <w:r>
-        <w:t xml:space="preserve"> </w:t>
-      </w:r>
-      <w:r>
-        <w:rPr>
-          <w:rStyle w:val="VerbatimChar"/>
-        </w:rPr>
-        <w:t xml:space="preserve">/api/health</w:t>
-      </w:r>
-      <w:r>
-        <w:t xml:space="preserve">.</w:t>
+        <w:t xml:space="preserve">CloudWatch Logs del backend (Figura 13).</w:t>
       </w:r>
     </w:p>
     <w:p>
@@ -6534,19 +7105,7 @@
         </w:numPr>
       </w:pPr>
       <w:r>
-        <w:t xml:space="preserve">CloudWatch Logs de</w:t>
-      </w:r>
-      <w:r>
-        <w:t xml:space="preserve"> </w:t>
-      </w:r>
-      <w:r>
-        <w:rPr>
-          <w:rStyle w:val="VerbatimChar"/>
-        </w:rPr>
-        <w:t xml:space="preserve">/ecs/tienda-backend</w:t>
-      </w:r>
-      <w:r>
-        <w:t xml:space="preserve">.</w:t>
+        <w:t xml:space="preserve">Política de autoscaling + métrica de CPU (Figuras 8 y 9).</w:t>
       </w:r>
     </w:p>
     <w:p>
@@ -6558,7 +7117,20 @@
         </w:numPr>
       </w:pPr>
       <w:r>
-        <w:t xml:space="preserve">Política de autoscaling (Service → Auto Scaling) + gráfico de CPU bajo carga.</w:t>
+        <w:t xml:space="preserve">Eventos del servicio (</w:t>
+      </w:r>
+      <w:r>
+        <w:rPr>
+          <w:i/>
+          <w:iCs/>
+        </w:rPr>
+        <w:t xml:space="preserve">steady state</w:t>
+      </w:r>
+      <w:r>
+        <w:t xml:space="preserve"> </w:t>
+      </w:r>
+      <w:r>
+        <w:t xml:space="preserve">/ registro de destinos) (Figura 14).</w:t>
       </w:r>
     </w:p>
     <w:p>
@@ -6570,7 +7142,7 @@
         </w:numPr>
       </w:pPr>
       <w:r>
-        <w:t xml:space="preserve">Evento de autorecuperación (task reemplazada).</w:t>
+        <w:t xml:space="preserve">Repositorios en Amazon ECR (Figura 7).</w:t>
       </w:r>
     </w:p>
     <w:p>
@@ -6582,24 +7154,7 @@
         </w:numPr>
       </w:pPr>
       <w:r>
-        <w:t xml:space="preserve">Pestaña Actions de GitHub con un run en verde.</w:t>
-      </w:r>
-    </w:p>
-    <w:p>
-      <w:r>
-        <w:pict>
-          <v:rect style="width:0;height:1.5pt" o:hralign="center" o:hrstd="t" o:hr="t"/>
-        </w:pict>
-      </w:r>
-    </w:p>
-    <w:bookmarkEnd w:id="28"/>
-    <w:bookmarkStart w:id="29" w:name="anexo-b--glosario-rápido-para-la-defensa"/>
-    <w:p>
-      <w:pPr>
-        <w:pStyle w:val="Heading2"/>
-      </w:pPr>
-      <w:r>
-        <w:t xml:space="preserve">Anexo B — Glosario rápido (para la defensa)</w:t>
+        <w:t xml:space="preserve">Secrets: SSM Parameter Store (Figura 11) y GitHub Actions Secrets (Figura 12).</w:t>
       </w:r>
     </w:p>
     <w:p>
@@ -6611,14 +7166,24 @@
         </w:numPr>
       </w:pPr>
       <w:r>
-        <w:rPr>
-          <w:b/>
-          <w:bCs/>
-        </w:rPr>
-        <w:t xml:space="preserve">ECS</w:t>
-      </w:r>
-      <w:r>
-        <w:t xml:space="preserve">: servicio de orquestación de contenedores de AWS.</w:t>
+        <w:t xml:space="preserve">Pipeline de GitHub Actions en verde (Figura 10).</w:t>
+      </w:r>
+    </w:p>
+    <w:p>
+      <w:r>
+        <w:pict>
+          <v:rect style="width:0;height:1.5pt" o:hralign="center" o:hrstd="t" o:hr="t"/>
+        </w:pict>
+      </w:r>
+    </w:p>
+    <w:bookmarkEnd w:id="70"/>
+    <w:bookmarkStart w:id="71" w:name="anexo-b--glosario-rápido-para-la-defensa"/>
+    <w:p>
+      <w:pPr>
+        <w:pStyle w:val="Heading2"/>
+      </w:pPr>
+      <w:r>
+        <w:t xml:space="preserve">Anexo B — Glosario rápido (para la defensa)</w:t>
       </w:r>
     </w:p>
     <w:p>
@@ -6626,7 +7191,7 @@
         <w:pStyle w:val="Compact"/>
         <w:numPr>
           <w:ilvl w:val="0"/>
-          <w:numId w:val="1020"/>
+          <w:numId w:val="1021"/>
         </w:numPr>
       </w:pPr>
       <w:r>
@@ -6634,26 +7199,10 @@
           <w:b/>
           <w:bCs/>
         </w:rPr>
-        <w:t xml:space="preserve">Fargate</w:t>
-      </w:r>
-      <w:r>
-        <w:t xml:space="preserve">: motor</w:t>
-      </w:r>
-      <w:r>
-        <w:t xml:space="preserve"> </w:t>
-      </w:r>
-      <w:r>
-        <w:rPr>
-          <w:i/>
-          <w:iCs/>
-        </w:rPr>
-        <w:t xml:space="preserve">serverless</w:t>
-      </w:r>
-      <w:r>
-        <w:t xml:space="preserve"> </w:t>
-      </w:r>
-      <w:r>
-        <w:t xml:space="preserve">de ECS; AWS administra los servidores subyacentes.</w:t>
+        <w:t xml:space="preserve">ECS</w:t>
+      </w:r>
+      <w:r>
+        <w:t xml:space="preserve">: servicio de orquestación de contenedores de AWS.</w:t>
       </w:r>
     </w:p>
     <w:p>
@@ -6661,7 +7210,7 @@
         <w:pStyle w:val="Compact"/>
         <w:numPr>
           <w:ilvl w:val="0"/>
-          <w:numId w:val="1020"/>
+          <w:numId w:val="1021"/>
         </w:numPr>
       </w:pPr>
       <w:r>
@@ -6669,10 +7218,26 @@
           <w:b/>
           <w:bCs/>
         </w:rPr>
-        <w:t xml:space="preserve">Task Definition</w:t>
-      </w:r>
-      <w:r>
-        <w:t xml:space="preserve">: "plantilla" que describe un contenedor (imagen, CPU/mem, puertos, variables, secrets, logs).</w:t>
+        <w:t xml:space="preserve">Fargate</w:t>
+      </w:r>
+      <w:r>
+        <w:t xml:space="preserve">: motor</w:t>
+      </w:r>
+      <w:r>
+        <w:t xml:space="preserve"> </w:t>
+      </w:r>
+      <w:r>
+        <w:rPr>
+          <w:i/>
+          <w:iCs/>
+        </w:rPr>
+        <w:t xml:space="preserve">serverless</w:t>
+      </w:r>
+      <w:r>
+        <w:t xml:space="preserve"> </w:t>
+      </w:r>
+      <w:r>
+        <w:t xml:space="preserve">de ECS; AWS administra los servidores subyacentes.</w:t>
       </w:r>
     </w:p>
     <w:p>
@@ -6680,7 +7245,7 @@
         <w:pStyle w:val="Compact"/>
         <w:numPr>
           <w:ilvl w:val="0"/>
-          <w:numId w:val="1020"/>
+          <w:numId w:val="1021"/>
         </w:numPr>
       </w:pPr>
       <w:r>
@@ -6688,19 +7253,10 @@
           <w:b/>
           <w:bCs/>
         </w:rPr>
-        <w:t xml:space="preserve">Servicio ECS</w:t>
-      </w:r>
-      <w:r>
-        <w:t xml:space="preserve">: mantiene N tasks corriendo (</w:t>
-      </w:r>
-      <w:r>
-        <w:rPr>
-          <w:rStyle w:val="VerbatimChar"/>
-        </w:rPr>
-        <w:t xml:space="preserve">desiredCount</w:t>
-      </w:r>
-      <w:r>
-        <w:t xml:space="preserve">) y las integra con el balanceador.</w:t>
+        <w:t xml:space="preserve">Task Definition</w:t>
+      </w:r>
+      <w:r>
+        <w:t xml:space="preserve">: "plantilla" que describe un contenedor (imagen, CPU/mem, puertos, variables, secrets, logs).</w:t>
       </w:r>
     </w:p>
     <w:p>
@@ -6708,7 +7264,7 @@
         <w:pStyle w:val="Compact"/>
         <w:numPr>
           <w:ilvl w:val="0"/>
-          <w:numId w:val="1020"/>
+          <w:numId w:val="1021"/>
         </w:numPr>
       </w:pPr>
       <w:r>
@@ -6716,10 +7272,19 @@
           <w:b/>
           <w:bCs/>
         </w:rPr>
-        <w:t xml:space="preserve">ALB / NLB</w:t>
-      </w:r>
-      <w:r>
-        <w:t xml:space="preserve">: balanceadores de capa 7 (HTTP, enruta por ruta) y capa 4 (TCP), respectivamente.</w:t>
+        <w:t xml:space="preserve">Servicio ECS</w:t>
+      </w:r>
+      <w:r>
+        <w:t xml:space="preserve">: mantiene N tasks corriendo (</w:t>
+      </w:r>
+      <w:r>
+        <w:rPr>
+          <w:rStyle w:val="VerbatimChar"/>
+        </w:rPr>
+        <w:t xml:space="preserve">desiredCount</w:t>
+      </w:r>
+      <w:r>
+        <w:t xml:space="preserve">) y las integra con el balanceador.</w:t>
       </w:r>
     </w:p>
     <w:p>
@@ -6727,7 +7292,7 @@
         <w:pStyle w:val="Compact"/>
         <w:numPr>
           <w:ilvl w:val="0"/>
-          <w:numId w:val="1020"/>
+          <w:numId w:val="1021"/>
         </w:numPr>
       </w:pPr>
       <w:r>
@@ -6735,10 +7300,10 @@
           <w:b/>
           <w:bCs/>
         </w:rPr>
-        <w:t xml:space="preserve">Target Group</w:t>
-      </w:r>
-      <w:r>
-        <w:t xml:space="preserve">: conjunto de destinos (tasks) que un balanceador chequea y al que envía tráfico.</w:t>
+        <w:t xml:space="preserve">ALB / NLB</w:t>
+      </w:r>
+      <w:r>
+        <w:t xml:space="preserve">: balanceadores de capa 7 (HTTP, enruta por ruta) y capa 4 (TCP), respectivamente.</w:t>
       </w:r>
     </w:p>
     <w:p>
@@ -6746,7 +7311,7 @@
         <w:pStyle w:val="Compact"/>
         <w:numPr>
           <w:ilvl w:val="0"/>
-          <w:numId w:val="1020"/>
+          <w:numId w:val="1021"/>
         </w:numPr>
       </w:pPr>
       <w:r>
@@ -6754,10 +7319,10 @@
           <w:b/>
           <w:bCs/>
         </w:rPr>
-        <w:t xml:space="preserve">Target Tracking</w:t>
-      </w:r>
-      <w:r>
-        <w:t xml:space="preserve">: política de autoscaling que ajusta el N° de tasks para mantener una métrica en un objetivo (CPU 50%).</w:t>
+        <w:t xml:space="preserve">Target Group</w:t>
+      </w:r>
+      <w:r>
+        <w:t xml:space="preserve">: conjunto de destinos (tasks) que un balanceador chequea y al que envía tráfico.</w:t>
       </w:r>
     </w:p>
     <w:p>
@@ -6765,7 +7330,7 @@
         <w:pStyle w:val="Compact"/>
         <w:numPr>
           <w:ilvl w:val="0"/>
-          <w:numId w:val="1020"/>
+          <w:numId w:val="1021"/>
         </w:numPr>
       </w:pPr>
       <w:r>
@@ -6773,10 +7338,10 @@
           <w:b/>
           <w:bCs/>
         </w:rPr>
-        <w:t xml:space="preserve">Circuit breaker</w:t>
-      </w:r>
-      <w:r>
-        <w:t xml:space="preserve">: mecanismo de ECS que revierte un despliegue si las tasks nuevas no estabilizan.</w:t>
+        <w:t xml:space="preserve">Target Tracking</w:t>
+      </w:r>
+      <w:r>
+        <w:t xml:space="preserve">: política de autoscaling que ajusta el N° de tasks para mantener una métrica en un objetivo (CPU 50%).</w:t>
       </w:r>
     </w:p>
     <w:p>
@@ -6784,7 +7349,7 @@
         <w:pStyle w:val="Compact"/>
         <w:numPr>
           <w:ilvl w:val="0"/>
-          <w:numId w:val="1020"/>
+          <w:numId w:val="1021"/>
         </w:numPr>
       </w:pPr>
       <w:r>
@@ -6792,10 +7357,10 @@
           <w:b/>
           <w:bCs/>
         </w:rPr>
-        <w:t xml:space="preserve">ECR</w:t>
-      </w:r>
-      <w:r>
-        <w:t xml:space="preserve">: registro privado de imágenes Docker de AWS.</w:t>
+        <w:t xml:space="preserve">Circuit breaker</w:t>
+      </w:r>
+      <w:r>
+        <w:t xml:space="preserve">: mecanismo de ECS que revierte un despliegue si las tasks nuevas no estabilizan.</w:t>
       </w:r>
     </w:p>
     <w:p>
@@ -6803,7 +7368,7 @@
         <w:pStyle w:val="Compact"/>
         <w:numPr>
           <w:ilvl w:val="0"/>
-          <w:numId w:val="1020"/>
+          <w:numId w:val="1021"/>
         </w:numPr>
       </w:pPr>
       <w:r>
@@ -6811,14 +7376,33 @@
           <w:b/>
           <w:bCs/>
         </w:rPr>
+        <w:t xml:space="preserve">ECR</w:t>
+      </w:r>
+      <w:r>
+        <w:t xml:space="preserve">: registro privado de imágenes Docker de AWS.</w:t>
+      </w:r>
+    </w:p>
+    <w:p>
+      <w:pPr>
+        <w:pStyle w:val="Compact"/>
+        <w:numPr>
+          <w:ilvl w:val="0"/>
+          <w:numId w:val="1021"/>
+        </w:numPr>
+      </w:pPr>
+      <w:r>
+        <w:rPr>
+          <w:b/>
+          <w:bCs/>
+        </w:rPr>
         <w:t xml:space="preserve">SSM Parameter Store</w:t>
       </w:r>
       <w:r>
         <w:t xml:space="preserve">: almacén de parámetros/secrets gestionado.</w:t>
       </w:r>
     </w:p>
-    <w:bookmarkEnd w:id="29"/>
-    <w:bookmarkEnd w:id="30"/>
+    <w:bookmarkEnd w:id="71"/>
+    <w:bookmarkEnd w:id="72"/>
     <w:sectPr>
       <w:footnotePr>
         <w:numRestart w:val="eachSect"/>
@@ -7117,12 +7701,12 @@
       </w:pPr>
     </w:lvl>
   </w:abstractNum>
-  <w:abstractNum w:abstractNumId="992">
-    <w:nsid w:val="0000A992"/>
+  <w:abstractNum w:abstractNumId="993">
+    <w:nsid w:val="0000A993"/>
     <w:multiLevelType w:val="multilevel"/>
     <w:lvl w:ilvl="0">
       <w:numFmt w:val="bullet"/>
-      <w:lvlText w:val="☐"/>
+      <w:lvlText w:val="☒"/>
       <w:lvlJc w:val="left"/>
       <w:pPr>
         <w:ind w:left="720" w:hanging="360"/>
@@ -7130,7 +7714,7 @@
     </w:lvl>
     <w:lvl w:ilvl="1">
       <w:numFmt w:val="bullet"/>
-      <w:lvlText w:val="☐"/>
+      <w:lvlText w:val="☒"/>
       <w:lvlJc w:val="left"/>
       <w:pPr>
         <w:ind w:left="1440" w:hanging="360"/>
@@ -7138,7 +7722,7 @@
     </w:lvl>
     <w:lvl w:ilvl="2">
       <w:numFmt w:val="bullet"/>
-      <w:lvlText w:val="☐"/>
+      <w:lvlText w:val="☒"/>
       <w:lvlJc w:val="left"/>
       <w:pPr>
         <w:ind w:left="2160" w:hanging="360"/>
@@ -7146,7 +7730,7 @@
     </w:lvl>
     <w:lvl w:ilvl="3">
       <w:numFmt w:val="bullet"/>
-      <w:lvlText w:val="☐"/>
+      <w:lvlText w:val="☒"/>
       <w:lvlJc w:val="left"/>
       <w:pPr>
         <w:ind w:left="2880" w:hanging="360"/>
@@ -7154,7 +7738,7 @@
     </w:lvl>
     <w:lvl w:ilvl="4">
       <w:numFmt w:val="bullet"/>
-      <w:lvlText w:val="☐"/>
+      <w:lvlText w:val="☒"/>
       <w:lvlJc w:val="left"/>
       <w:pPr>
         <w:ind w:left="3600" w:hanging="360"/>
@@ -7162,7 +7746,7 @@
     </w:lvl>
     <w:lvl w:ilvl="5">
       <w:numFmt w:val="bullet"/>
-      <w:lvlText w:val="☐"/>
+      <w:lvlText w:val="☒"/>
       <w:lvlJc w:val="left"/>
       <w:pPr>
         <w:ind w:left="4320" w:hanging="360"/>
@@ -7170,7 +7754,7 @@
     </w:lvl>
     <w:lvl w:ilvl="6">
       <w:numFmt w:val="bullet"/>
-      <w:lvlText w:val="☐"/>
+      <w:lvlText w:val="☒"/>
       <w:lvlJc w:val="left"/>
       <w:pPr>
         <w:ind w:left="5040" w:hanging="360"/>
@@ -7178,7 +7762,7 @@
     </w:lvl>
     <w:lvl w:ilvl="7">
       <w:numFmt w:val="bullet"/>
-      <w:lvlText w:val="☐"/>
+      <w:lvlText w:val="☒"/>
       <w:lvlJc w:val="left"/>
       <w:pPr>
         <w:ind w:left="5760" w:hanging="360"/>
@@ -7186,7 +7770,7 @@
     </w:lvl>
     <w:lvl w:ilvl="8">
       <w:numFmt w:val="bullet"/>
-      <w:lvlText w:val="☐"/>
+      <w:lvlText w:val="☒"/>
       <w:lvlJc w:val="left"/>
       <w:pPr>
         <w:ind w:left="6480" w:hanging="360"/>
@@ -7305,36 +7889,39 @@
     <w:abstractNumId w:val="991"/>
   </w:num>
   <w:num w:numId="1010">
-    <w:abstractNumId w:val="992"/>
+    <w:abstractNumId w:val="993"/>
   </w:num>
   <w:num w:numId="1011">
-    <w:abstractNumId w:val="992"/>
+    <w:abstractNumId w:val="993"/>
   </w:num>
   <w:num w:numId="1012">
-    <w:abstractNumId w:val="992"/>
+    <w:abstractNumId w:val="993"/>
   </w:num>
   <w:num w:numId="1013">
-    <w:abstractNumId w:val="992"/>
+    <w:abstractNumId w:val="993"/>
   </w:num>
   <w:num w:numId="1014">
-    <w:abstractNumId w:val="992"/>
+    <w:abstractNumId w:val="993"/>
   </w:num>
   <w:num w:numId="1015">
-    <w:abstractNumId w:val="992"/>
+    <w:abstractNumId w:val="993"/>
   </w:num>
   <w:num w:numId="1016">
-    <w:abstractNumId w:val="992"/>
+    <w:abstractNumId w:val="993"/>
   </w:num>
   <w:num w:numId="1017">
-    <w:abstractNumId w:val="992"/>
+    <w:abstractNumId w:val="993"/>
   </w:num>
   <w:num w:numId="1018">
-    <w:abstractNumId w:val="992"/>
+    <w:abstractNumId w:val="993"/>
   </w:num>
   <w:num w:numId="1019">
-    <w:abstractNumId w:val="992"/>
+    <w:abstractNumId w:val="993"/>
   </w:num>
   <w:num w:numId="1020">
+    <w:abstractNumId w:val="993"/>
+  </w:num>
+  <w:num w:numId="1021">
     <w:abstractNumId w:val="991"/>
   </w:num>
 </w:numbering>

</xml_diff>

<commit_message>
docs(informe): portada con datos en lista y recorta capturas (sin pestanas ni barra de tareas)
- Encabezado: cada dato del informe en su propia linea (antes iban de corrido).
- Las 14 evidencias recortadas para mostrar solo el contenido de pantalla.

Co-Authored-By: Claude Opus 4.8 <noreply@anthropic.com>
Claude-Session: https://claude.ai/code/session_01RGSUNUR7x2rUumoScYtZwM
</commit_message>
<xml_diff>
--- a/docs/Informe-Tecnico-EP3.docx
+++ b/docs/Informe-Tecnico-EP3.docx
@@ -40,15 +40,26 @@
     <w:bookmarkStart w:id="10" w:name="Xa68293ba3090a85fa2363ad9861ad9c1885ee3c"/>
     <w:p>
       <w:pPr>
-        <w:pStyle w:val="Heading2"/>
+        <w:pStyle w:val="Heading3"/>
       </w:pPr>
       <w:r>
         <w:t xml:space="preserve">Tienda de Perritos · AWS ECS Fargate + CI/CD con GitHub Actions</w:t>
       </w:r>
     </w:p>
     <w:p>
-      <w:pPr>
-        <w:pStyle w:val="FirstParagraph"/>
+      <w:r>
+        <w:pict>
+          <v:rect style="width:0;height:1.5pt" o:hralign="center" o:hrstd="t" o:hr="t"/>
+        </w:pict>
+      </w:r>
+    </w:p>
+    <w:p>
+      <w:pPr>
+        <w:pStyle w:val="Compact"/>
+        <w:numPr>
+          <w:ilvl w:val="0"/>
+          <w:numId w:val="1001"/>
+        </w:numPr>
       </w:pPr>
       <w:r>
         <w:rPr>
@@ -63,9 +74,15 @@
       <w:r>
         <w:t xml:space="preserve">Introducción a Herramientas DevOps (ISY1101)</w:t>
       </w:r>
-      <w:r>
-        <w:t xml:space="preserve"> </w:t>
-      </w:r>
+    </w:p>
+    <w:p>
+      <w:pPr>
+        <w:pStyle w:val="Compact"/>
+        <w:numPr>
+          <w:ilvl w:val="0"/>
+          <w:numId w:val="1001"/>
+        </w:numPr>
+      </w:pPr>
       <w:r>
         <w:rPr>
           <w:b/>
@@ -79,15 +96,21 @@
       <w:r>
         <w:t xml:space="preserve">Parcial N°3 — Encargo con Presentación</w:t>
       </w:r>
-      <w:r>
-        <w:t xml:space="preserve"> </w:t>
-      </w:r>
-      <w:r>
-        <w:rPr>
-          <w:b/>
-          <w:bCs/>
-        </w:rPr>
-        <w:t xml:space="preserve">Empresa (caso):</w:t>
+    </w:p>
+    <w:p>
+      <w:pPr>
+        <w:pStyle w:val="Compact"/>
+        <w:numPr>
+          <w:ilvl w:val="0"/>
+          <w:numId w:val="1001"/>
+        </w:numPr>
+      </w:pPr>
+      <w:r>
+        <w:rPr>
+          <w:b/>
+          <w:bCs/>
+        </w:rPr>
+        <w:t xml:space="preserve">Caso de estudio:</w:t>
       </w:r>
       <w:r>
         <w:t xml:space="preserve"> </w:t>
@@ -95,9 +118,15 @@
       <w:r>
         <w:t xml:space="preserve">Innovatech Chile</w:t>
       </w:r>
-      <w:r>
-        <w:t xml:space="preserve"> </w:t>
-      </w:r>
+    </w:p>
+    <w:p>
+      <w:pPr>
+        <w:pStyle w:val="Compact"/>
+        <w:numPr>
+          <w:ilvl w:val="0"/>
+          <w:numId w:val="1001"/>
+        </w:numPr>
+      </w:pPr>
       <w:r>
         <w:rPr>
           <w:b/>
@@ -111,9 +140,15 @@
       <w:r>
         <w:t xml:space="preserve">Gabriel Molina · Jefferson Rojas</w:t>
       </w:r>
-      <w:r>
-        <w:t xml:space="preserve"> </w:t>
-      </w:r>
+    </w:p>
+    <w:p>
+      <w:pPr>
+        <w:pStyle w:val="Compact"/>
+        <w:numPr>
+          <w:ilvl w:val="0"/>
+          <w:numId w:val="1001"/>
+        </w:numPr>
+      </w:pPr>
       <w:r>
         <w:rPr>
           <w:b/>
@@ -127,9 +162,15 @@
       <w:r>
         <w:t xml:space="preserve">Junio 2026</w:t>
       </w:r>
-      <w:r>
-        <w:t xml:space="preserve"> </w:t>
-      </w:r>
+    </w:p>
+    <w:p>
+      <w:pPr>
+        <w:pStyle w:val="Compact"/>
+        <w:numPr>
+          <w:ilvl w:val="0"/>
+          <w:numId w:val="1001"/>
+        </w:numPr>
+      </w:pPr>
       <w:r>
         <w:rPr>
           <w:b/>
@@ -323,7 +364,7 @@
         <w:pStyle w:val="Compact"/>
         <w:numPr>
           <w:ilvl w:val="0"/>
-          <w:numId w:val="1001"/>
+          <w:numId w:val="1002"/>
         </w:numPr>
       </w:pPr>
       <w:r>
@@ -355,7 +396,7 @@
         <w:pStyle w:val="Compact"/>
         <w:numPr>
           <w:ilvl w:val="0"/>
-          <w:numId w:val="1001"/>
+          <w:numId w:val="1002"/>
         </w:numPr>
       </w:pPr>
       <w:r>
@@ -403,7 +444,7 @@
         <w:pStyle w:val="Compact"/>
         <w:numPr>
           <w:ilvl w:val="0"/>
-          <w:numId w:val="1001"/>
+          <w:numId w:val="1002"/>
         </w:numPr>
       </w:pPr>
       <w:r>
@@ -1267,7 +1308,7 @@
         <w:pStyle w:val="Compact"/>
         <w:numPr>
           <w:ilvl w:val="0"/>
-          <w:numId w:val="1002"/>
+          <w:numId w:val="1003"/>
         </w:numPr>
       </w:pPr>
       <w:r>
@@ -1286,7 +1327,7 @@
         <w:pStyle w:val="Compact"/>
         <w:numPr>
           <w:ilvl w:val="0"/>
-          <w:numId w:val="1002"/>
+          <w:numId w:val="1003"/>
         </w:numPr>
       </w:pPr>
       <w:r>
@@ -1334,7 +1375,7 @@
         <w:pStyle w:val="Compact"/>
         <w:numPr>
           <w:ilvl w:val="0"/>
-          <w:numId w:val="1002"/>
+          <w:numId w:val="1003"/>
         </w:numPr>
       </w:pPr>
       <w:r>
@@ -1397,7 +1438,7 @@
         <w:pStyle w:val="Compact"/>
         <w:numPr>
           <w:ilvl w:val="0"/>
-          <w:numId w:val="1002"/>
+          <w:numId w:val="1003"/>
         </w:numPr>
       </w:pPr>
       <w:r>
@@ -1842,7 +1883,7 @@
       <w:r>
         <w:drawing>
           <wp:inline>
-            <wp:extent cx="5334000" cy="3333750"/>
+            <wp:extent cx="5334000" cy="2941320"/>
             <wp:effectExtent b="0" l="0" r="0" t="0"/>
             <wp:docPr descr="Figura 1 — Clúster tienda-cluster (Fargate) con los 3 servicios activos: tienda-db, tienda-backend y tienda-frontend." title="" id="16" name="Picture"/>
             <a:graphic>
@@ -1863,7 +1904,7 @@
                   <pic:spPr bwMode="auto">
                     <a:xfrm>
                       <a:off x="0" y="0"/>
-                      <a:ext cx="5334000" cy="3333750"/>
+                      <a:ext cx="5334000" cy="2941320"/>
                     </a:xfrm>
                     <a:prstGeom prst="rect">
                       <a:avLst/>
@@ -1889,7 +1930,7 @@
       <w:r>
         <w:drawing>
           <wp:inline>
-            <wp:extent cx="5334000" cy="3333750"/>
+            <wp:extent cx="5334000" cy="2941320"/>
             <wp:effectExtent b="0" l="0" r="0" t="0"/>
             <wp:docPr descr="Figura 2 — Security Group tienda-ecs-sg: reglas de entrada (80/3001 desde el ALB, 3306 dentro de la VPC)." title="" id="19" name="Picture"/>
             <a:graphic>
@@ -1910,7 +1951,7 @@
                   <pic:spPr bwMode="auto">
                     <a:xfrm>
                       <a:off x="0" y="0"/>
-                      <a:ext cx="5334000" cy="3333750"/>
+                      <a:ext cx="5334000" cy="2941320"/>
                     </a:xfrm>
                     <a:prstGeom prst="rect">
                       <a:avLst/>
@@ -1936,7 +1977,7 @@
       <w:r>
         <w:drawing>
           <wp:inline>
-            <wp:extent cx="5334000" cy="3333750"/>
+            <wp:extent cx="5334000" cy="2941320"/>
             <wp:effectExtent b="0" l="0" r="0" t="0"/>
             <wp:docPr descr="Figura 3 — Security Group tienda-alb-sg: regla de entrada del puerto 80 desde Internet." title="" id="22" name="Picture"/>
             <a:graphic>
@@ -1957,7 +1998,7 @@
                   <pic:spPr bwMode="auto">
                     <a:xfrm>
                       <a:off x="0" y="0"/>
-                      <a:ext cx="5334000" cy="3333750"/>
+                      <a:ext cx="5334000" cy="2941320"/>
                     </a:xfrm>
                     <a:prstGeom prst="rect">
                       <a:avLst/>
@@ -2034,7 +2075,7 @@
         <w:pStyle w:val="Compact"/>
         <w:numPr>
           <w:ilvl w:val="0"/>
-          <w:numId w:val="1003"/>
+          <w:numId w:val="1004"/>
         </w:numPr>
       </w:pPr>
       <w:r>
@@ -2089,7 +2130,7 @@
         <w:pStyle w:val="Compact"/>
         <w:numPr>
           <w:ilvl w:val="0"/>
-          <w:numId w:val="1003"/>
+          <w:numId w:val="1004"/>
         </w:numPr>
       </w:pPr>
       <w:r>
@@ -2168,7 +2209,7 @@
         <w:pStyle w:val="Compact"/>
         <w:numPr>
           <w:ilvl w:val="0"/>
-          <w:numId w:val="1003"/>
+          <w:numId w:val="1004"/>
         </w:numPr>
       </w:pPr>
       <w:r>
@@ -2241,7 +2282,7 @@
         <w:pStyle w:val="Compact"/>
         <w:numPr>
           <w:ilvl w:val="0"/>
-          <w:numId w:val="1003"/>
+          <w:numId w:val="1004"/>
         </w:numPr>
       </w:pPr>
       <w:r>
@@ -2345,7 +2386,7 @@
         <w:pStyle w:val="Compact"/>
         <w:numPr>
           <w:ilvl w:val="0"/>
-          <w:numId w:val="1003"/>
+          <w:numId w:val="1004"/>
         </w:numPr>
       </w:pPr>
       <w:r>
@@ -2400,7 +2441,7 @@
         <w:pStyle w:val="Compact"/>
         <w:numPr>
           <w:ilvl w:val="0"/>
-          <w:numId w:val="1003"/>
+          <w:numId w:val="1004"/>
         </w:numPr>
       </w:pPr>
       <w:r>
@@ -2795,7 +2836,7 @@
       <w:r>
         <w:drawing>
           <wp:inline>
-            <wp:extent cx="5334000" cy="3333750"/>
+            <wp:extent cx="5334000" cy="2941320"/>
             <wp:effectExtent b="0" l="0" r="0" t="0"/>
             <wp:docPr descr="Figura 4 — Aplicación funcionando en el navegador (URL del ALB): tabla de productos cargada desde el backend y formulario CRUD. Demuestra Frontend → Backend → MySQL operativo." title="" id="26" name="Picture"/>
             <a:graphic>
@@ -2816,7 +2857,7 @@
                   <pic:spPr bwMode="auto">
                     <a:xfrm>
                       <a:off x="0" y="0"/>
-                      <a:ext cx="5334000" cy="3333750"/>
+                      <a:ext cx="5334000" cy="2941320"/>
                     </a:xfrm>
                     <a:prstGeom prst="rect">
                       <a:avLst/>
@@ -2842,7 +2883,7 @@
       <w:r>
         <w:drawing>
           <wp:inline>
-            <wp:extent cx="5334000" cy="3333750"/>
+            <wp:extent cx="5334000" cy="2941320"/>
             <wp:effectExtent b="0" l="0" r="0" t="0"/>
             <wp:docPr descr="Figura 5 — Regla del listener HTTP:80 del ALB: el patrón de ruta /api/* se enruta al target group del backend." title="" id="29" name="Picture"/>
             <a:graphic>
@@ -2863,7 +2904,7 @@
                   <pic:spPr bwMode="auto">
                     <a:xfrm>
                       <a:off x="0" y="0"/>
-                      <a:ext cx="5334000" cy="3333750"/>
+                      <a:ext cx="5334000" cy="2941320"/>
                     </a:xfrm>
                     <a:prstGeom prst="rect">
                       <a:avLst/>
@@ -2889,7 +2930,7 @@
       <w:r>
         <w:drawing>
           <wp:inline>
-            <wp:extent cx="5334000" cy="3333750"/>
+            <wp:extent cx="5334000" cy="2941320"/>
             <wp:effectExtent b="0" l="0" r="0" t="0"/>
             <wp:docPr descr="Figura 6 — Target group del backend con destinos registrados (estado de salud de las tasks)." title="" id="32" name="Picture"/>
             <a:graphic>
@@ -2910,7 +2951,7 @@
                   <pic:spPr bwMode="auto">
                     <a:xfrm>
                       <a:off x="0" y="0"/>
-                      <a:ext cx="5334000" cy="3333750"/>
+                      <a:ext cx="5334000" cy="2941320"/>
                     </a:xfrm>
                     <a:prstGeom prst="rect">
                       <a:avLst/>
@@ -2936,7 +2977,7 @@
       <w:r>
         <w:drawing>
           <wp:inline>
-            <wp:extent cx="5334000" cy="3333750"/>
+            <wp:extent cx="5334000" cy="2941320"/>
             <wp:effectExtent b="0" l="0" r="0" t="0"/>
             <wp:docPr descr="Figura 7 — Repositorios privados en Amazon ECR: tienda-frontend, tienda-backend y tienda-db." title="" id="35" name="Picture"/>
             <a:graphic>
@@ -2957,7 +2998,7 @@
                   <pic:spPr bwMode="auto">
                     <a:xfrm>
                       <a:off x="0" y="0"/>
-                      <a:ext cx="5334000" cy="3333750"/>
+                      <a:ext cx="5334000" cy="2941320"/>
                     </a:xfrm>
                     <a:prstGeom prst="rect">
                       <a:avLst/>
@@ -3657,7 +3698,7 @@
       <w:r>
         <w:drawing>
           <wp:inline>
-            <wp:extent cx="5334000" cy="3333750"/>
+            <wp:extent cx="5334000" cy="2941320"/>
             <wp:effectExtent b="0" l="0" r="0" t="0"/>
             <wp:docPr descr="Figura 8 — Servicio backend → Escalamiento automático: política de Target Tracking (CPU 50%) y registro de actividades de escalado." title="" id="39" name="Picture"/>
             <a:graphic>
@@ -3678,7 +3719,7 @@
                   <pic:spPr bwMode="auto">
                     <a:xfrm>
                       <a:off x="0" y="0"/>
-                      <a:ext cx="5334000" cy="3333750"/>
+                      <a:ext cx="5334000" cy="2941320"/>
                     </a:xfrm>
                     <a:prstGeom prst="rect">
                       <a:avLst/>
@@ -3704,7 +3745,7 @@
       <w:r>
         <w:drawing>
           <wp:inline>
-            <wp:extent cx="5334000" cy="3333750"/>
+            <wp:extent cx="5334000" cy="2941320"/>
             <wp:effectExtent b="0" l="0" r="0" t="0"/>
             <wp:docPr descr="Figura 9 — CloudWatch → Métricas: utilización de CPU (CPUUtilization) del servicio en el tiempo." title="" id="42" name="Picture"/>
             <a:graphic>
@@ -3725,7 +3766,7 @@
                   <pic:spPr bwMode="auto">
                     <a:xfrm>
                       <a:off x="0" y="0"/>
-                      <a:ext cx="5334000" cy="3333750"/>
+                      <a:ext cx="5334000" cy="2941320"/>
                     </a:xfrm>
                     <a:prstGeom prst="rect">
                       <a:avLst/>
@@ -3865,7 +3906,7 @@
         <w:pStyle w:val="Compact"/>
         <w:numPr>
           <w:ilvl w:val="0"/>
-          <w:numId w:val="1004"/>
+          <w:numId w:val="1005"/>
         </w:numPr>
       </w:pPr>
       <w:r>
@@ -3887,7 +3928,7 @@
         <w:pStyle w:val="Compact"/>
         <w:numPr>
           <w:ilvl w:val="0"/>
-          <w:numId w:val="1004"/>
+          <w:numId w:val="1005"/>
         </w:numPr>
       </w:pPr>
       <w:r>
@@ -3925,7 +3966,7 @@
         <w:pStyle w:val="Compact"/>
         <w:numPr>
           <w:ilvl w:val="0"/>
-          <w:numId w:val="1004"/>
+          <w:numId w:val="1005"/>
         </w:numPr>
       </w:pPr>
       <w:r>
@@ -3944,7 +3985,7 @@
         <w:pStyle w:val="Compact"/>
         <w:numPr>
           <w:ilvl w:val="0"/>
-          <w:numId w:val="1004"/>
+          <w:numId w:val="1005"/>
         </w:numPr>
       </w:pPr>
       <w:r>
@@ -3966,7 +4007,7 @@
         <w:pStyle w:val="Compact"/>
         <w:numPr>
           <w:ilvl w:val="0"/>
-          <w:numId w:val="1004"/>
+          <w:numId w:val="1005"/>
         </w:numPr>
       </w:pPr>
       <w:r>
@@ -4015,7 +4056,7 @@
         <w:pStyle w:val="Compact"/>
         <w:numPr>
           <w:ilvl w:val="0"/>
-          <w:numId w:val="1004"/>
+          <w:numId w:val="1005"/>
         </w:numPr>
       </w:pPr>
       <w:r>
@@ -4052,7 +4093,7 @@
         <w:pStyle w:val="Compact"/>
         <w:numPr>
           <w:ilvl w:val="0"/>
-          <w:numId w:val="1004"/>
+          <w:numId w:val="1005"/>
         </w:numPr>
       </w:pPr>
       <w:r>
@@ -4159,7 +4200,7 @@
       <w:r>
         <w:drawing>
           <wp:inline>
-            <wp:extent cx="5334000" cy="3333750"/>
+            <wp:extent cx="5334000" cy="2941320"/>
             <wp:effectExtent b="0" l="0" r="0" t="0"/>
             <wp:docPr descr="Figura 10 — GitHub Actions: ejecución del pipeline completa y exitosa (build → push a ECR → deploy a ECS de backend y frontend)." title="" id="46" name="Picture"/>
             <a:graphic>
@@ -4180,7 +4221,7 @@
                   <pic:spPr bwMode="auto">
                     <a:xfrm>
                       <a:off x="0" y="0"/>
-                      <a:ext cx="5334000" cy="3333750"/>
+                      <a:ext cx="5334000" cy="2941320"/>
                     </a:xfrm>
                     <a:prstGeom prst="rect">
                       <a:avLst/>
@@ -4555,7 +4596,7 @@
       <w:r>
         <w:drawing>
           <wp:inline>
-            <wp:extent cx="5334000" cy="3333750"/>
+            <wp:extent cx="5334000" cy="2941320"/>
             <wp:effectExtent b="0" l="0" r="0" t="0"/>
             <wp:docPr descr="Figura 11 — AWS Systems Manager → Parameter Store: parámetro /tienda/db_password de tipo SecureString (contraseña cifrada, fuera del repositorio)." title="" id="50" name="Picture"/>
             <a:graphic>
@@ -4576,7 +4617,7 @@
                   <pic:spPr bwMode="auto">
                     <a:xfrm>
                       <a:off x="0" y="0"/>
-                      <a:ext cx="5334000" cy="3333750"/>
+                      <a:ext cx="5334000" cy="2941320"/>
                     </a:xfrm>
                     <a:prstGeom prst="rect">
                       <a:avLst/>
@@ -4602,7 +4643,7 @@
       <w:r>
         <w:drawing>
           <wp:inline>
-            <wp:extent cx="5334000" cy="3333750"/>
+            <wp:extent cx="5334000" cy="2941320"/>
             <wp:effectExtent b="0" l="0" r="0" t="0"/>
             <wp:docPr descr="Figura 12 — GitHub → Settings → Secrets and variables → Actions: credenciales de AWS almacenadas como repository secrets." title="" id="53" name="Picture"/>
             <a:graphic>
@@ -4623,7 +4664,7 @@
                   <pic:spPr bwMode="auto">
                     <a:xfrm>
                       <a:off x="0" y="0"/>
-                      <a:ext cx="5334000" cy="3333750"/>
+                      <a:ext cx="5334000" cy="2941320"/>
                     </a:xfrm>
                     <a:prstGeom prst="rect">
                       <a:avLst/>
@@ -4699,7 +4740,7 @@
         <w:pStyle w:val="Compact"/>
         <w:numPr>
           <w:ilvl w:val="0"/>
-          <w:numId w:val="1005"/>
+          <w:numId w:val="1006"/>
         </w:numPr>
       </w:pPr>
       <w:r>
@@ -4714,7 +4755,7 @@
         <w:pStyle w:val="Compact"/>
         <w:numPr>
           <w:ilvl w:val="0"/>
-          <w:numId w:val="1005"/>
+          <w:numId w:val="1006"/>
         </w:numPr>
       </w:pPr>
       <w:r>
@@ -4729,7 +4770,7 @@
         <w:pStyle w:val="Compact"/>
         <w:numPr>
           <w:ilvl w:val="0"/>
-          <w:numId w:val="1005"/>
+          <w:numId w:val="1006"/>
         </w:numPr>
       </w:pPr>
       <w:r>
@@ -4763,7 +4804,7 @@
       <w:r>
         <w:drawing>
           <wp:inline>
-            <wp:extent cx="5334000" cy="3333750"/>
+            <wp:extent cx="5334000" cy="2941320"/>
             <wp:effectExtent b="0" l="0" r="0" t="0"/>
             <wp:docPr descr="Figura 13 — CloudWatch Logs del backend: el contenedor inicializa el pool de conexiones MySQL y queda escuchando en el puerto 3001." title="" id="57" name="Picture"/>
             <a:graphic>
@@ -4784,7 +4825,7 @@
                   <pic:spPr bwMode="auto">
                     <a:xfrm>
                       <a:off x="0" y="0"/>
-                      <a:ext cx="5334000" cy="3333750"/>
+                      <a:ext cx="5334000" cy="2941320"/>
                     </a:xfrm>
                     <a:prstGeom prst="rect">
                       <a:avLst/>
@@ -5180,7 +5221,7 @@
         <w:pStyle w:val="Compact"/>
         <w:numPr>
           <w:ilvl w:val="0"/>
-          <w:numId w:val="1006"/>
+          <w:numId w:val="1007"/>
         </w:numPr>
       </w:pPr>
       <w:r>
@@ -5257,363 +5298,6 @@
       </w:r>
       <w:r>
         <w:t xml:space="preserve">pasa health checks y drena las antiguas).</w:t>
-      </w:r>
-    </w:p>
-    <w:p>
-      <w:pPr>
-        <w:pStyle w:val="Compact"/>
-        <w:numPr>
-          <w:ilvl w:val="0"/>
-          <w:numId w:val="1006"/>
-        </w:numPr>
-      </w:pPr>
-      <w:r>
-        <w:t xml:space="preserve">La diferencia entre run #2 (~10 min) y run #4 (~16 min) se explica porque el run #4 desplegó</w:t>
-      </w:r>
-      <w:r>
-        <w:t xml:space="preserve"> </w:t>
-      </w:r>
-      <w:r>
-        <w:rPr>
-          <w:b/>
-          <w:bCs/>
-        </w:rPr>
-        <w:t xml:space="preserve">dos servicios</w:t>
-      </w:r>
-      <w:r>
-        <w:t xml:space="preserve"> </w:t>
-      </w:r>
-      <w:r>
-        <w:t xml:space="preserve">(backend y frontend) y coincidió con otra ejecución en curso.</w:t>
-      </w:r>
-    </w:p>
-    <w:bookmarkEnd w:id="60"/>
-    <w:bookmarkStart w:id="61" w:name="X0bc19e1b22b535ffb1a970e0aeccd8acab39308"/>
-    <w:p>
-      <w:pPr>
-        <w:pStyle w:val="Heading3"/>
-      </w:pPr>
-      <w:r>
-        <w:t xml:space="preserve">8.3 Análisis de fallas (causa raíz, extraída de los logs)</w:t>
-      </w:r>
-    </w:p>
-    <w:p>
-      <w:pPr>
-        <w:pStyle w:val="FirstParagraph"/>
-      </w:pPr>
-      <w:r>
-        <w:rPr>
-          <w:b/>
-          <w:bCs/>
-        </w:rPr>
-        <w:t xml:space="preserve">Falla run #1 —</w:t>
-      </w:r>
-      <w:r>
-        <w:rPr>
-          <w:b/>
-          <w:bCs/>
-        </w:rPr>
-        <w:t xml:space="preserve"> </w:t>
-      </w:r>
-      <w:r>
-        <w:rPr>
-          <w:rStyle w:val="VerbatimChar"/>
-          <w:b/>
-          <w:bCs/>
-        </w:rPr>
-        <w:t xml:space="preserve">Could not load credentials from any providers</w:t>
-      </w:r>
-      <w:r>
-        <w:rPr>
-          <w:b/>
-          <w:bCs/>
-        </w:rPr>
-        <w:t xml:space="preserve">:</w:t>
-      </w:r>
-      <w:r>
-        <w:t xml:space="preserve"> </w:t>
-      </w:r>
-      <w:r>
-        <w:t xml:space="preserve">La primera ejecución por</w:t>
-      </w:r>
-      <w:r>
-        <w:t xml:space="preserve"> </w:t>
-      </w:r>
-      <w:r>
-        <w:rPr>
-          <w:rStyle w:val="VerbatimChar"/>
-        </w:rPr>
-        <w:t xml:space="preserve">push</w:t>
-      </w:r>
-      <w:r>
-        <w:t xml:space="preserve"> </w:t>
-      </w:r>
-      <w:r>
-        <w:t xml:space="preserve">falló en</w:t>
-      </w:r>
-      <w:r>
-        <w:t xml:space="preserve"> </w:t>
-      </w:r>
-      <w:r>
-        <w:rPr>
-          <w:b/>
-          <w:bCs/>
-        </w:rPr>
-        <w:t xml:space="preserve">16 segundos</w:t>
-      </w:r>
-      <w:r>
-        <w:t xml:space="preserve"> </w:t>
-      </w:r>
-      <w:r>
-        <w:t xml:space="preserve">en el paso</w:t>
-      </w:r>
-      <w:r>
-        <w:t xml:space="preserve"> </w:t>
-      </w:r>
-      <w:r>
-        <w:rPr>
-          <w:i/>
-          <w:iCs/>
-        </w:rPr>
-        <w:t xml:space="preserve">Configurar credenciales AWS</w:t>
-      </w:r>
-      <w:r>
-        <w:t xml:space="preserve">,</w:t>
-      </w:r>
-      <w:r>
-        <w:t xml:space="preserve"> </w:t>
-      </w:r>
-      <w:r>
-        <w:t xml:space="preserve">porque los</w:t>
-      </w:r>
-      <w:r>
-        <w:t xml:space="preserve"> </w:t>
-      </w:r>
-      <w:r>
-        <w:rPr>
-          <w:i/>
-          <w:iCs/>
-        </w:rPr>
-        <w:t xml:space="preserve">secrets</w:t>
-      </w:r>
-      <w:r>
-        <w:t xml:space="preserve"> </w:t>
-      </w:r>
-      <w:r>
-        <w:t xml:space="preserve">(</w:t>
-      </w:r>
-      <w:r>
-        <w:rPr>
-          <w:rStyle w:val="VerbatimChar"/>
-        </w:rPr>
-        <w:t xml:space="preserve">AWS_ACCESS_KEY_ID</w:t>
-      </w:r>
-      <w:r>
-        <w:t xml:space="preserve">, etc.)</w:t>
-      </w:r>
-      <w:r>
-        <w:t xml:space="preserve"> </w:t>
-      </w:r>
-      <w:r>
-        <w:rPr>
-          <w:b/>
-          <w:bCs/>
-        </w:rPr>
-        <w:t xml:space="preserve">aún no estaban cargados</w:t>
-      </w:r>
-      <w:r>
-        <w:t xml:space="preserve"> </w:t>
-      </w:r>
-      <w:r>
-        <w:t xml:space="preserve">en el repositorio.</w:t>
-      </w:r>
-      <w:r>
-        <w:t xml:space="preserve"> </w:t>
-      </w:r>
-      <w:r>
-        <w:rPr>
-          <w:i/>
-          <w:iCs/>
-        </w:rPr>
-        <w:t xml:space="preserve">Solución:</w:t>
-      </w:r>
-      <w:r>
-        <w:t xml:space="preserve"> </w:t>
-      </w:r>
-      <w:r>
-        <w:t xml:space="preserve">cargar los 3 secrets del Learner Lab en Settings → Secrets → Actions y reejecutar.</w:t>
-      </w:r>
-    </w:p>
-    <w:p>
-      <w:pPr>
-        <w:pStyle w:val="BodyText"/>
-      </w:pPr>
-      <w:r>
-        <w:rPr>
-          <w:b/>
-          <w:bCs/>
-        </w:rPr>
-        <w:t xml:space="preserve">Falla run #3 —</w:t>
-      </w:r>
-      <w:r>
-        <w:rPr>
-          <w:b/>
-          <w:bCs/>
-        </w:rPr>
-        <w:t xml:space="preserve"> </w:t>
-      </w:r>
-      <w:r>
-        <w:rPr>
-          <w:rStyle w:val="VerbatimChar"/>
-          <w:b/>
-          <w:bCs/>
-        </w:rPr>
-        <w:t xml:space="preserve">Deployment ... rolled back by the deployment circuit breaker</w:t>
-      </w:r>
-      <w:r>
-        <w:rPr>
-          <w:b/>
-          <w:bCs/>
-        </w:rPr>
-        <w:t xml:space="preserve">:</w:t>
-      </w:r>
-      <w:r>
-        <w:t xml:space="preserve"> </w:t>
-      </w:r>
-      <w:r>
-        <w:t xml:space="preserve">Con las credenciales ya configuradas, el deploy del backend arrancó pero</w:t>
-      </w:r>
-      <w:r>
-        <w:t xml:space="preserve"> </w:t>
-      </w:r>
-      <w:r>
-        <w:rPr>
-          <w:b/>
-          <w:bCs/>
-        </w:rPr>
-        <w:t xml:space="preserve">no estabilizó</w:t>
-      </w:r>
-      <w:r>
-        <w:t xml:space="preserve">, y el</w:t>
-      </w:r>
-      <w:r>
-        <w:t xml:space="preserve"> </w:t>
-      </w:r>
-      <w:r>
-        <w:rPr>
-          <w:b/>
-          <w:bCs/>
-        </w:rPr>
-        <w:t xml:space="preserve">circuit breaker de despliegue de ECS hizo</w:t>
-      </w:r>
-      <w:r>
-        <w:rPr>
-          <w:b/>
-          <w:bCs/>
-        </w:rPr>
-        <w:t xml:space="preserve"> </w:t>
-      </w:r>
-      <w:r>
-        <w:rPr>
-          <w:b/>
-          <w:bCs/>
-          <w:i/>
-          <w:iCs/>
-        </w:rPr>
-        <w:t xml:space="preserve">rollback</w:t>
-      </w:r>
-      <w:r>
-        <w:rPr>
-          <w:b/>
-          <w:bCs/>
-        </w:rPr>
-        <w:t xml:space="preserve"> </w:t>
-      </w:r>
-      <w:r>
-        <w:rPr>
-          <w:b/>
-          <w:bCs/>
-        </w:rPr>
-        <w:t xml:space="preserve">automático</w:t>
-      </w:r>
-      <w:r>
-        <w:t xml:space="preserve"> </w:t>
-      </w:r>
-      <w:r>
-        <w:t xml:space="preserve">a la versión anterior. Causa</w:t>
-      </w:r>
-      <w:r>
-        <w:t xml:space="preserve"> </w:t>
-      </w:r>
-      <w:r>
-        <w:t xml:space="preserve">probable: las tasks nuevas no superaron el</w:t>
-      </w:r>
-      <w:r>
-        <w:t xml:space="preserve"> </w:t>
-      </w:r>
-      <w:r>
-        <w:rPr>
-          <w:i/>
-          <w:iCs/>
-        </w:rPr>
-        <w:t xml:space="preserve">health check</w:t>
-      </w:r>
-      <w:r>
-        <w:t xml:space="preserve"> </w:t>
-      </w:r>
-      <w:r>
-        <w:t xml:space="preserve">a tiempo (o la ejecución coincidió con</w:t>
-      </w:r>
-      <w:r>
-        <w:t xml:space="preserve"> </w:t>
-      </w:r>
-      <w:r>
-        <w:t xml:space="preserve">otro deploy simultáneo sobre el mismo servicio).</w:t>
-      </w:r>
-      <w:r>
-        <w:t xml:space="preserve"> </w:t>
-      </w:r>
-      <w:r>
-        <w:rPr>
-          <w:i/>
-          <w:iCs/>
-        </w:rPr>
-        <w:t xml:space="preserve">Solución:</w:t>
-      </w:r>
-      <w:r>
-        <w:t xml:space="preserve"> </w:t>
-      </w:r>
-      <w:r>
-        <w:t xml:space="preserve">relanzar el pipeline una vez liberado</w:t>
-      </w:r>
-      <w:r>
-        <w:t xml:space="preserve"> </w:t>
-      </w:r>
-      <w:r>
-        <w:t xml:space="preserve">el servicio (run #4 quedó</w:t>
-      </w:r>
-      <w:r>
-        <w:t xml:space="preserve"> </w:t>
-      </w:r>
-      <w:r>
-        <w:rPr>
-          <w:b/>
-          <w:bCs/>
-        </w:rPr>
-        <w:t xml:space="preserve">estable y en verde</w:t>
-      </w:r>
-      <w:r>
-        <w:t xml:space="preserve">, ver Figura 10).</w:t>
-      </w:r>
-    </w:p>
-    <w:bookmarkEnd w:id="61"/>
-    <w:bookmarkStart w:id="62" w:name="X164a52664c04dad42c1501e810d8e74b399bb4e"/>
-    <w:p>
-      <w:pPr>
-        <w:pStyle w:val="Heading3"/>
-      </w:pPr>
-      <w:r>
-        <w:t xml:space="preserve">8.4 Conclusiones del análisis</w:t>
       </w:r>
     </w:p>
     <w:p>
@@ -5625,41 +5309,352 @@
         </w:numPr>
       </w:pPr>
       <w:r>
-        <w:t xml:space="preserve">El pipeline es</w:t>
-      </w:r>
-      <w:r>
-        <w:t xml:space="preserve"> </w:t>
-      </w:r>
-      <w:r>
-        <w:rPr>
-          <w:b/>
-          <w:bCs/>
-        </w:rPr>
-        <w:t xml:space="preserve">funcional y reproducible</w:t>
-      </w:r>
-      <w:r>
-        <w:t xml:space="preserve">: tras configurar correctamente los secrets, las</w:t>
-      </w:r>
-      <w:r>
-        <w:t xml:space="preserve"> </w:t>
-      </w:r>
-      <w:r>
-        <w:t xml:space="preserve">ejecuciones #2 y #4 completaron</w:t>
-      </w:r>
-      <w:r>
+        <w:t xml:space="preserve">La diferencia entre run #2 (~10 min) y run #4 (~16 min) se explica porque el run #4 desplegó</w:t>
+      </w:r>
+      <w:r>
+        <w:t xml:space="preserve"> </w:t>
+      </w:r>
+      <w:r>
+        <w:rPr>
+          <w:b/>
+          <w:bCs/>
+        </w:rPr>
+        <w:t xml:space="preserve">dos servicios</w:t>
+      </w:r>
+      <w:r>
+        <w:t xml:space="preserve"> </w:t>
+      </w:r>
+      <w:r>
+        <w:t xml:space="preserve">(backend y frontend) y coincidió con otra ejecución en curso.</w:t>
+      </w:r>
+    </w:p>
+    <w:bookmarkEnd w:id="60"/>
+    <w:bookmarkStart w:id="61" w:name="X0bc19e1b22b535ffb1a970e0aeccd8acab39308"/>
+    <w:p>
+      <w:pPr>
+        <w:pStyle w:val="Heading3"/>
+      </w:pPr>
+      <w:r>
+        <w:t xml:space="preserve">8.3 Análisis de fallas (causa raíz, extraída de los logs)</w:t>
+      </w:r>
+    </w:p>
+    <w:p>
+      <w:pPr>
+        <w:pStyle w:val="FirstParagraph"/>
+      </w:pPr>
+      <w:r>
+        <w:rPr>
+          <w:b/>
+          <w:bCs/>
+        </w:rPr>
+        <w:t xml:space="preserve">Falla run #1 —</w:t>
+      </w:r>
+      <w:r>
+        <w:rPr>
+          <w:b/>
+          <w:bCs/>
+        </w:rPr>
         <w:t xml:space="preserve"> </w:t>
       </w:r>
       <w:r>
         <w:rPr>
           <w:rStyle w:val="VerbatimChar"/>
-        </w:rPr>
-        <w:t xml:space="preserve">build → push → deploy</w:t>
-      </w:r>
-      <w:r>
-        <w:t xml:space="preserve"> </w:t>
-      </w:r>
-      <w:r>
-        <w:t xml:space="preserve">con éxito.</w:t>
+          <w:b/>
+          <w:bCs/>
+        </w:rPr>
+        <w:t xml:space="preserve">Could not load credentials from any providers</w:t>
+      </w:r>
+      <w:r>
+        <w:rPr>
+          <w:b/>
+          <w:bCs/>
+        </w:rPr>
+        <w:t xml:space="preserve">:</w:t>
+      </w:r>
+      <w:r>
+        <w:t xml:space="preserve"> </w:t>
+      </w:r>
+      <w:r>
+        <w:t xml:space="preserve">La primera ejecución por</w:t>
+      </w:r>
+      <w:r>
+        <w:t xml:space="preserve"> </w:t>
+      </w:r>
+      <w:r>
+        <w:rPr>
+          <w:rStyle w:val="VerbatimChar"/>
+        </w:rPr>
+        <w:t xml:space="preserve">push</w:t>
+      </w:r>
+      <w:r>
+        <w:t xml:space="preserve"> </w:t>
+      </w:r>
+      <w:r>
+        <w:t xml:space="preserve">falló en</w:t>
+      </w:r>
+      <w:r>
+        <w:t xml:space="preserve"> </w:t>
+      </w:r>
+      <w:r>
+        <w:rPr>
+          <w:b/>
+          <w:bCs/>
+        </w:rPr>
+        <w:t xml:space="preserve">16 segundos</w:t>
+      </w:r>
+      <w:r>
+        <w:t xml:space="preserve"> </w:t>
+      </w:r>
+      <w:r>
+        <w:t xml:space="preserve">en el paso</w:t>
+      </w:r>
+      <w:r>
+        <w:t xml:space="preserve"> </w:t>
+      </w:r>
+      <w:r>
+        <w:rPr>
+          <w:i/>
+          <w:iCs/>
+        </w:rPr>
+        <w:t xml:space="preserve">Configurar credenciales AWS</w:t>
+      </w:r>
+      <w:r>
+        <w:t xml:space="preserve">,</w:t>
+      </w:r>
+      <w:r>
+        <w:t xml:space="preserve"> </w:t>
+      </w:r>
+      <w:r>
+        <w:t xml:space="preserve">porque los</w:t>
+      </w:r>
+      <w:r>
+        <w:t xml:space="preserve"> </w:t>
+      </w:r>
+      <w:r>
+        <w:rPr>
+          <w:i/>
+          <w:iCs/>
+        </w:rPr>
+        <w:t xml:space="preserve">secrets</w:t>
+      </w:r>
+      <w:r>
+        <w:t xml:space="preserve"> </w:t>
+      </w:r>
+      <w:r>
+        <w:t xml:space="preserve">(</w:t>
+      </w:r>
+      <w:r>
+        <w:rPr>
+          <w:rStyle w:val="VerbatimChar"/>
+        </w:rPr>
+        <w:t xml:space="preserve">AWS_ACCESS_KEY_ID</w:t>
+      </w:r>
+      <w:r>
+        <w:t xml:space="preserve">, etc.)</w:t>
+      </w:r>
+      <w:r>
+        <w:t xml:space="preserve"> </w:t>
+      </w:r>
+      <w:r>
+        <w:rPr>
+          <w:b/>
+          <w:bCs/>
+        </w:rPr>
+        <w:t xml:space="preserve">aún no estaban cargados</w:t>
+      </w:r>
+      <w:r>
+        <w:t xml:space="preserve"> </w:t>
+      </w:r>
+      <w:r>
+        <w:t xml:space="preserve">en el repositorio.</w:t>
+      </w:r>
+      <w:r>
+        <w:t xml:space="preserve"> </w:t>
+      </w:r>
+      <w:r>
+        <w:rPr>
+          <w:i/>
+          <w:iCs/>
+        </w:rPr>
+        <w:t xml:space="preserve">Solución:</w:t>
+      </w:r>
+      <w:r>
+        <w:t xml:space="preserve"> </w:t>
+      </w:r>
+      <w:r>
+        <w:t xml:space="preserve">cargar los 3 secrets del Learner Lab en Settings → Secrets → Actions y reejecutar.</w:t>
+      </w:r>
+    </w:p>
+    <w:p>
+      <w:pPr>
+        <w:pStyle w:val="BodyText"/>
+      </w:pPr>
+      <w:r>
+        <w:rPr>
+          <w:b/>
+          <w:bCs/>
+        </w:rPr>
+        <w:t xml:space="preserve">Falla run #3 —</w:t>
+      </w:r>
+      <w:r>
+        <w:rPr>
+          <w:b/>
+          <w:bCs/>
+        </w:rPr>
+        <w:t xml:space="preserve"> </w:t>
+      </w:r>
+      <w:r>
+        <w:rPr>
+          <w:rStyle w:val="VerbatimChar"/>
+          <w:b/>
+          <w:bCs/>
+        </w:rPr>
+        <w:t xml:space="preserve">Deployment ... rolled back by the deployment circuit breaker</w:t>
+      </w:r>
+      <w:r>
+        <w:rPr>
+          <w:b/>
+          <w:bCs/>
+        </w:rPr>
+        <w:t xml:space="preserve">:</w:t>
+      </w:r>
+      <w:r>
+        <w:t xml:space="preserve"> </w:t>
+      </w:r>
+      <w:r>
+        <w:t xml:space="preserve">Con las credenciales ya configuradas, el deploy del backend arrancó pero</w:t>
+      </w:r>
+      <w:r>
+        <w:t xml:space="preserve"> </w:t>
+      </w:r>
+      <w:r>
+        <w:rPr>
+          <w:b/>
+          <w:bCs/>
+        </w:rPr>
+        <w:t xml:space="preserve">no estabilizó</w:t>
+      </w:r>
+      <w:r>
+        <w:t xml:space="preserve">, y el</w:t>
+      </w:r>
+      <w:r>
+        <w:t xml:space="preserve"> </w:t>
+      </w:r>
+      <w:r>
+        <w:rPr>
+          <w:b/>
+          <w:bCs/>
+        </w:rPr>
+        <w:t xml:space="preserve">circuit breaker de despliegue de ECS hizo</w:t>
+      </w:r>
+      <w:r>
+        <w:rPr>
+          <w:b/>
+          <w:bCs/>
+        </w:rPr>
+        <w:t xml:space="preserve"> </w:t>
+      </w:r>
+      <w:r>
+        <w:rPr>
+          <w:b/>
+          <w:bCs/>
+          <w:i/>
+          <w:iCs/>
+        </w:rPr>
+        <w:t xml:space="preserve">rollback</w:t>
+      </w:r>
+      <w:r>
+        <w:rPr>
+          <w:b/>
+          <w:bCs/>
+        </w:rPr>
+        <w:t xml:space="preserve"> </w:t>
+      </w:r>
+      <w:r>
+        <w:rPr>
+          <w:b/>
+          <w:bCs/>
+        </w:rPr>
+        <w:t xml:space="preserve">automático</w:t>
+      </w:r>
+      <w:r>
+        <w:t xml:space="preserve"> </w:t>
+      </w:r>
+      <w:r>
+        <w:t xml:space="preserve">a la versión anterior. Causa</w:t>
+      </w:r>
+      <w:r>
+        <w:t xml:space="preserve"> </w:t>
+      </w:r>
+      <w:r>
+        <w:t xml:space="preserve">probable: las tasks nuevas no superaron el</w:t>
+      </w:r>
+      <w:r>
+        <w:t xml:space="preserve"> </w:t>
+      </w:r>
+      <w:r>
+        <w:rPr>
+          <w:i/>
+          <w:iCs/>
+        </w:rPr>
+        <w:t xml:space="preserve">health check</w:t>
+      </w:r>
+      <w:r>
+        <w:t xml:space="preserve"> </w:t>
+      </w:r>
+      <w:r>
+        <w:t xml:space="preserve">a tiempo (o la ejecución coincidió con</w:t>
+      </w:r>
+      <w:r>
+        <w:t xml:space="preserve"> </w:t>
+      </w:r>
+      <w:r>
+        <w:t xml:space="preserve">otro deploy simultáneo sobre el mismo servicio).</w:t>
+      </w:r>
+      <w:r>
+        <w:t xml:space="preserve"> </w:t>
+      </w:r>
+      <w:r>
+        <w:rPr>
+          <w:i/>
+          <w:iCs/>
+        </w:rPr>
+        <w:t xml:space="preserve">Solución:</w:t>
+      </w:r>
+      <w:r>
+        <w:t xml:space="preserve"> </w:t>
+      </w:r>
+      <w:r>
+        <w:t xml:space="preserve">relanzar el pipeline una vez liberado</w:t>
+      </w:r>
+      <w:r>
+        <w:t xml:space="preserve"> </w:t>
+      </w:r>
+      <w:r>
+        <w:t xml:space="preserve">el servicio (run #4 quedó</w:t>
+      </w:r>
+      <w:r>
+        <w:t xml:space="preserve"> </w:t>
+      </w:r>
+      <w:r>
+        <w:rPr>
+          <w:b/>
+          <w:bCs/>
+        </w:rPr>
+        <w:t xml:space="preserve">estable y en verde</w:t>
+      </w:r>
+      <w:r>
+        <w:t xml:space="preserve">, ver Figura 10).</w:t>
+      </w:r>
+    </w:p>
+    <w:bookmarkEnd w:id="61"/>
+    <w:bookmarkStart w:id="62" w:name="X164a52664c04dad42c1501e810d8e74b399bb4e"/>
+    <w:p>
+      <w:pPr>
+        <w:pStyle w:val="Heading3"/>
+      </w:pPr>
+      <w:r>
+        <w:t xml:space="preserve">8.4 Conclusiones del análisis</w:t>
       </w:r>
     </w:p>
     <w:p>
@@ -5667,62 +5662,45 @@
         <w:pStyle w:val="Compact"/>
         <w:numPr>
           <w:ilvl w:val="0"/>
-          <w:numId w:val="1007"/>
+          <w:numId w:val="1008"/>
         </w:numPr>
       </w:pPr>
       <w:r>
-        <w:t xml:space="preserve">Las fallas observadas</w:t>
-      </w:r>
-      <w:r>
-        <w:t xml:space="preserve"> </w:t>
-      </w:r>
-      <w:r>
-        <w:rPr>
-          <w:b/>
-          <w:bCs/>
-        </w:rPr>
-        <w:t xml:space="preserve">no fueron del código</w:t>
-      </w:r>
-      <w:r>
-        <w:t xml:space="preserve">, sino de</w:t>
-      </w:r>
-      <w:r>
-        <w:t xml:space="preserve"> </w:t>
-      </w:r>
-      <w:r>
-        <w:rPr>
-          <w:b/>
-          <w:bCs/>
-        </w:rPr>
-        <w:t xml:space="preserve">configuración</w:t>
-      </w:r>
-      <w:r>
-        <w:t xml:space="preserve"> </w:t>
-      </w:r>
-      <w:r>
-        <w:t xml:space="preserve">(secrets ausentes) y</w:t>
-      </w:r>
-      <w:r>
-        <w:t xml:space="preserve"> </w:t>
-      </w:r>
-      <w:r>
-        <w:t xml:space="preserve">de</w:t>
-      </w:r>
-      <w:r>
-        <w:t xml:space="preserve"> </w:t>
-      </w:r>
-      <w:r>
-        <w:rPr>
-          <w:b/>
-          <w:bCs/>
-        </w:rPr>
-        <w:t xml:space="preserve">estabilización del despliegue</w:t>
-      </w:r>
-      <w:r>
-        <w:t xml:space="preserve"> </w:t>
-      </w:r>
-      <w:r>
-        <w:t xml:space="preserve">(circuit breaker) — ambas diagnosticables desde los logs.</w:t>
+        <w:t xml:space="preserve">El pipeline es</w:t>
+      </w:r>
+      <w:r>
+        <w:t xml:space="preserve"> </w:t>
+      </w:r>
+      <w:r>
+        <w:rPr>
+          <w:b/>
+          <w:bCs/>
+        </w:rPr>
+        <w:t xml:space="preserve">funcional y reproducible</w:t>
+      </w:r>
+      <w:r>
+        <w:t xml:space="preserve">: tras configurar correctamente los secrets, las</w:t>
+      </w:r>
+      <w:r>
+        <w:t xml:space="preserve"> </w:t>
+      </w:r>
+      <w:r>
+        <w:t xml:space="preserve">ejecuciones #2 y #4 completaron</w:t>
+      </w:r>
+      <w:r>
+        <w:t xml:space="preserve"> </w:t>
+      </w:r>
+      <w:r>
+        <w:rPr>
+          <w:rStyle w:val="VerbatimChar"/>
+        </w:rPr>
+        <w:t xml:space="preserve">build → push → deploy</w:t>
+      </w:r>
+      <w:r>
+        <w:t xml:space="preserve"> </w:t>
+      </w:r>
+      <w:r>
+        <w:t xml:space="preserve">con éxito.</w:t>
       </w:r>
     </w:p>
     <w:p>
@@ -5730,7 +5708,70 @@
         <w:pStyle w:val="Compact"/>
         <w:numPr>
           <w:ilvl w:val="0"/>
-          <w:numId w:val="1007"/>
+          <w:numId w:val="1008"/>
+        </w:numPr>
+      </w:pPr>
+      <w:r>
+        <w:t xml:space="preserve">Las fallas observadas</w:t>
+      </w:r>
+      <w:r>
+        <w:t xml:space="preserve"> </w:t>
+      </w:r>
+      <w:r>
+        <w:rPr>
+          <w:b/>
+          <w:bCs/>
+        </w:rPr>
+        <w:t xml:space="preserve">no fueron del código</w:t>
+      </w:r>
+      <w:r>
+        <w:t xml:space="preserve">, sino de</w:t>
+      </w:r>
+      <w:r>
+        <w:t xml:space="preserve"> </w:t>
+      </w:r>
+      <w:r>
+        <w:rPr>
+          <w:b/>
+          <w:bCs/>
+        </w:rPr>
+        <w:t xml:space="preserve">configuración</w:t>
+      </w:r>
+      <w:r>
+        <w:t xml:space="preserve"> </w:t>
+      </w:r>
+      <w:r>
+        <w:t xml:space="preserve">(secrets ausentes) y</w:t>
+      </w:r>
+      <w:r>
+        <w:t xml:space="preserve"> </w:t>
+      </w:r>
+      <w:r>
+        <w:t xml:space="preserve">de</w:t>
+      </w:r>
+      <w:r>
+        <w:t xml:space="preserve"> </w:t>
+      </w:r>
+      <w:r>
+        <w:rPr>
+          <w:b/>
+          <w:bCs/>
+        </w:rPr>
+        <w:t xml:space="preserve">estabilización del despliegue</w:t>
+      </w:r>
+      <w:r>
+        <w:t xml:space="preserve"> </w:t>
+      </w:r>
+      <w:r>
+        <w:t xml:space="preserve">(circuit breaker) — ambas diagnosticables desde los logs.</w:t>
+      </w:r>
+    </w:p>
+    <w:p>
+      <w:pPr>
+        <w:pStyle w:val="Compact"/>
+        <w:numPr>
+          <w:ilvl w:val="0"/>
+          <w:numId w:val="1008"/>
         </w:numPr>
       </w:pPr>
       <w:r>
@@ -6055,7 +6096,7 @@
         <w:pStyle w:val="Compact"/>
         <w:numPr>
           <w:ilvl w:val="0"/>
-          <w:numId w:val="1008"/>
+          <w:numId w:val="1009"/>
         </w:numPr>
       </w:pPr>
       <w:r>
@@ -6083,7 +6124,7 @@
         <w:pStyle w:val="Compact"/>
         <w:numPr>
           <w:ilvl w:val="0"/>
-          <w:numId w:val="1008"/>
+          <w:numId w:val="1009"/>
         </w:numPr>
       </w:pPr>
       <w:r>
@@ -6121,7 +6162,7 @@
         <w:pStyle w:val="Compact"/>
         <w:numPr>
           <w:ilvl w:val="0"/>
-          <w:numId w:val="1008"/>
+          <w:numId w:val="1009"/>
         </w:numPr>
       </w:pPr>
       <w:r>
@@ -6149,7 +6190,7 @@
         <w:pStyle w:val="Compact"/>
         <w:numPr>
           <w:ilvl w:val="0"/>
-          <w:numId w:val="1008"/>
+          <w:numId w:val="1009"/>
         </w:numPr>
       </w:pPr>
       <w:r>
@@ -6199,7 +6240,7 @@
         <w:pStyle w:val="Compact"/>
         <w:numPr>
           <w:ilvl w:val="0"/>
-          <w:numId w:val="1008"/>
+          <w:numId w:val="1009"/>
         </w:numPr>
       </w:pPr>
       <w:r>
@@ -6235,7 +6276,7 @@
       <w:r>
         <w:drawing>
           <wp:inline>
-            <wp:extent cx="5334000" cy="3333750"/>
+            <wp:extent cx="5334000" cy="2941320"/>
             <wp:effectExtent b="0" l="0" r="0" t="0"/>
             <wp:docPr descr="Figura 14 — Eventos del servicio tienda-backend: despliegues alcanzando steady state y registro/baja de destinos en el balanceador." title="" id="65" name="Picture"/>
             <a:graphic>
@@ -6256,7 +6297,7 @@
                   <pic:spPr bwMode="auto">
                     <a:xfrm>
                       <a:off x="0" y="0"/>
-                      <a:ext cx="5334000" cy="3333750"/>
+                      <a:ext cx="5334000" cy="2941320"/>
                     </a:xfrm>
                     <a:prstGeom prst="rect">
                       <a:avLst/>
@@ -6786,7 +6827,7 @@
         <w:pStyle w:val="Compact"/>
         <w:numPr>
           <w:ilvl w:val="0"/>
-          <w:numId w:val="1009"/>
+          <w:numId w:val="1010"/>
         </w:numPr>
       </w:pPr>
       <w:r>
@@ -6822,151 +6863,6 @@
       </w:r>
       <w:r>
         <w:t xml:space="preserve">con privilegio mínimo.</w:t>
-      </w:r>
-    </w:p>
-    <w:p>
-      <w:pPr>
-        <w:pStyle w:val="Compact"/>
-        <w:numPr>
-          <w:ilvl w:val="0"/>
-          <w:numId w:val="1009"/>
-        </w:numPr>
-      </w:pPr>
-      <w:r>
-        <w:t xml:space="preserve">Migrar la BD a</w:t>
-      </w:r>
-      <w:r>
-        <w:t xml:space="preserve"> </w:t>
-      </w:r>
-      <w:r>
-        <w:rPr>
-          <w:b/>
-          <w:bCs/>
-        </w:rPr>
-        <w:t xml:space="preserve">Amazon RDS</w:t>
-      </w:r>
-      <w:r>
-        <w:t xml:space="preserve"> </w:t>
-      </w:r>
-      <w:r>
-        <w:t xml:space="preserve">(gestionada, con backups y multi-AZ) en lugar de un contenedor MySQL.</w:t>
-      </w:r>
-    </w:p>
-    <w:p>
-      <w:pPr>
-        <w:pStyle w:val="Compact"/>
-        <w:numPr>
-          <w:ilvl w:val="0"/>
-          <w:numId w:val="1009"/>
-        </w:numPr>
-      </w:pPr>
-      <w:r>
-        <w:t xml:space="preserve">Habilitar</w:t>
-      </w:r>
-      <w:r>
-        <w:t xml:space="preserve"> </w:t>
-      </w:r>
-      <w:r>
-        <w:rPr>
-          <w:b/>
-          <w:bCs/>
-        </w:rPr>
-        <w:t xml:space="preserve">HTTPS</w:t>
-      </w:r>
-      <w:r>
-        <w:t xml:space="preserve"> </w:t>
-      </w:r>
-      <w:r>
-        <w:t xml:space="preserve">en el ALB (certificado ACM) y un dominio propio (Route 53).</w:t>
-      </w:r>
-    </w:p>
-    <w:p>
-      <w:pPr>
-        <w:pStyle w:val="Compact"/>
-        <w:numPr>
-          <w:ilvl w:val="0"/>
-          <w:numId w:val="1009"/>
-        </w:numPr>
-      </w:pPr>
-      <w:r>
-        <w:t xml:space="preserve">Usar</w:t>
-      </w:r>
-      <w:r>
-        <w:t xml:space="preserve"> </w:t>
-      </w:r>
-      <w:r>
-        <w:rPr>
-          <w:b/>
-          <w:bCs/>
-        </w:rPr>
-        <w:t xml:space="preserve">OIDC</w:t>
-      </w:r>
-      <w:r>
-        <w:t xml:space="preserve"> </w:t>
-      </w:r>
-      <w:r>
-        <w:t xml:space="preserve">entre GitHub y AWS en vez de claves estáticas que caducan.</w:t>
-      </w:r>
-    </w:p>
-    <w:p>
-      <w:pPr>
-        <w:pStyle w:val="Compact"/>
-        <w:numPr>
-          <w:ilvl w:val="0"/>
-          <w:numId w:val="1009"/>
-        </w:numPr>
-      </w:pPr>
-      <w:r>
-        <w:t xml:space="preserve">Añadir</w:t>
-      </w:r>
-      <w:r>
-        <w:t xml:space="preserve"> </w:t>
-      </w:r>
-      <w:r>
-        <w:rPr>
-          <w:b/>
-          <w:bCs/>
-        </w:rPr>
-        <w:t xml:space="preserve">alarmas de CloudWatch</w:t>
-      </w:r>
-      <w:r>
-        <w:t xml:space="preserve"> </w:t>
-      </w:r>
-      <w:r>
-        <w:t xml:space="preserve">y un entorno de</w:t>
-      </w:r>
-      <w:r>
-        <w:t xml:space="preserve"> </w:t>
-      </w:r>
-      <w:r>
-        <w:rPr>
-          <w:i/>
-          <w:iCs/>
-        </w:rPr>
-        <w:t xml:space="preserve">staging</w:t>
-      </w:r>
-      <w:r>
-        <w:t xml:space="preserve"> </w:t>
-      </w:r>
-      <w:r>
-        <w:t xml:space="preserve">previo a producción.</w:t>
-      </w:r>
-    </w:p>
-    <w:p>
-      <w:r>
-        <w:pict>
-          <v:rect style="width:0;height:1.5pt" o:hralign="center" o:hrstd="t" o:hr="t"/>
-        </w:pict>
-      </w:r>
-    </w:p>
-    <w:bookmarkEnd w:id="69"/>
-    <w:bookmarkStart w:id="70" w:name="anexo-a--checklist-de-evidencias-estado"/>
-    <w:p>
-      <w:pPr>
-        <w:pStyle w:val="Heading2"/>
-      </w:pPr>
-      <w:r>
-        <w:t xml:space="preserve">Anexo A — Checklist de evidencias (estado)</w:t>
       </w:r>
     </w:p>
     <w:p>
@@ -6978,22 +6874,140 @@
         </w:numPr>
       </w:pPr>
       <w:r>
-        <w:t xml:space="preserve">Consola ECS: clúster</w:t>
-      </w:r>
-      <w:r>
-        <w:t xml:space="preserve"> </w:t>
-      </w:r>
-      <w:r>
-        <w:rPr>
-          <w:rStyle w:val="VerbatimChar"/>
-        </w:rPr>
-        <w:t xml:space="preserve">tienda-cluster</w:t>
-      </w:r>
-      <w:r>
-        <w:t xml:space="preserve"> </w:t>
-      </w:r>
-      <w:r>
-        <w:t xml:space="preserve">con los 3 servicios activos (Figura 1).</w:t>
+        <w:t xml:space="preserve">Migrar la BD a</w:t>
+      </w:r>
+      <w:r>
+        <w:t xml:space="preserve"> </w:t>
+      </w:r>
+      <w:r>
+        <w:rPr>
+          <w:b/>
+          <w:bCs/>
+        </w:rPr>
+        <w:t xml:space="preserve">Amazon RDS</w:t>
+      </w:r>
+      <w:r>
+        <w:t xml:space="preserve"> </w:t>
+      </w:r>
+      <w:r>
+        <w:t xml:space="preserve">(gestionada, con backups y multi-AZ) en lugar de un contenedor MySQL.</w:t>
+      </w:r>
+    </w:p>
+    <w:p>
+      <w:pPr>
+        <w:pStyle w:val="Compact"/>
+        <w:numPr>
+          <w:ilvl w:val="0"/>
+          <w:numId w:val="1010"/>
+        </w:numPr>
+      </w:pPr>
+      <w:r>
+        <w:t xml:space="preserve">Habilitar</w:t>
+      </w:r>
+      <w:r>
+        <w:t xml:space="preserve"> </w:t>
+      </w:r>
+      <w:r>
+        <w:rPr>
+          <w:b/>
+          <w:bCs/>
+        </w:rPr>
+        <w:t xml:space="preserve">HTTPS</w:t>
+      </w:r>
+      <w:r>
+        <w:t xml:space="preserve"> </w:t>
+      </w:r>
+      <w:r>
+        <w:t xml:space="preserve">en el ALB (certificado ACM) y un dominio propio (Route 53).</w:t>
+      </w:r>
+    </w:p>
+    <w:p>
+      <w:pPr>
+        <w:pStyle w:val="Compact"/>
+        <w:numPr>
+          <w:ilvl w:val="0"/>
+          <w:numId w:val="1010"/>
+        </w:numPr>
+      </w:pPr>
+      <w:r>
+        <w:t xml:space="preserve">Usar</w:t>
+      </w:r>
+      <w:r>
+        <w:t xml:space="preserve"> </w:t>
+      </w:r>
+      <w:r>
+        <w:rPr>
+          <w:b/>
+          <w:bCs/>
+        </w:rPr>
+        <w:t xml:space="preserve">OIDC</w:t>
+      </w:r>
+      <w:r>
+        <w:t xml:space="preserve"> </w:t>
+      </w:r>
+      <w:r>
+        <w:t xml:space="preserve">entre GitHub y AWS en vez de claves estáticas que caducan.</w:t>
+      </w:r>
+    </w:p>
+    <w:p>
+      <w:pPr>
+        <w:pStyle w:val="Compact"/>
+        <w:numPr>
+          <w:ilvl w:val="0"/>
+          <w:numId w:val="1010"/>
+        </w:numPr>
+      </w:pPr>
+      <w:r>
+        <w:t xml:space="preserve">Añadir</w:t>
+      </w:r>
+      <w:r>
+        <w:t xml:space="preserve"> </w:t>
+      </w:r>
+      <w:r>
+        <w:rPr>
+          <w:b/>
+          <w:bCs/>
+        </w:rPr>
+        <w:t xml:space="preserve">alarmas de CloudWatch</w:t>
+      </w:r>
+      <w:r>
+        <w:t xml:space="preserve"> </w:t>
+      </w:r>
+      <w:r>
+        <w:t xml:space="preserve">y un entorno de</w:t>
+      </w:r>
+      <w:r>
+        <w:t xml:space="preserve"> </w:t>
+      </w:r>
+      <w:r>
+        <w:rPr>
+          <w:i/>
+          <w:iCs/>
+        </w:rPr>
+        <w:t xml:space="preserve">staging</w:t>
+      </w:r>
+      <w:r>
+        <w:t xml:space="preserve"> </w:t>
+      </w:r>
+      <w:r>
+        <w:t xml:space="preserve">previo a producción.</w:t>
+      </w:r>
+    </w:p>
+    <w:p>
+      <w:r>
+        <w:pict>
+          <v:rect style="width:0;height:1.5pt" o:hralign="center" o:hrstd="t" o:hr="t"/>
+        </w:pict>
+      </w:r>
+    </w:p>
+    <w:bookmarkEnd w:id="69"/>
+    <w:bookmarkStart w:id="70" w:name="anexo-a--checklist-de-evidencias-estado"/>
+    <w:p>
+      <w:pPr>
+        <w:pStyle w:val="Heading2"/>
+      </w:pPr>
+      <w:r>
+        <w:t xml:space="preserve">Anexo A — Checklist de evidencias (estado)</w:t>
       </w:r>
     </w:p>
     <w:p>
@@ -7005,7 +7019,7 @@
         </w:numPr>
       </w:pPr>
       <w:r>
-        <w:t xml:space="preserve">Security Groups: reglas inbound de</w:t>
+        <w:t xml:space="preserve">Consola ECS: clúster</w:t>
       </w:r>
       <w:r>
         <w:t xml:space="preserve"> </w:t>
@@ -7014,28 +7028,13 @@
         <w:rPr>
           <w:rStyle w:val="VerbatimChar"/>
         </w:rPr>
-        <w:t xml:space="preserve">tienda-alb-sg</w:t>
-      </w:r>
-      <w:r>
-        <w:t xml:space="preserve"> </w:t>
-      </w:r>
-      <w:r>
-        <w:t xml:space="preserve">y</w:t>
-      </w:r>
-      <w:r>
-        <w:t xml:space="preserve"> </w:t>
-      </w:r>
-      <w:r>
-        <w:rPr>
-          <w:rStyle w:val="VerbatimChar"/>
-        </w:rPr>
-        <w:t xml:space="preserve">tienda-ecs-sg</w:t>
-      </w:r>
-      <w:r>
-        <w:t xml:space="preserve"> </w:t>
-      </w:r>
-      <w:r>
-        <w:t xml:space="preserve">(Figuras 2 y 3).</w:t>
+        <w:t xml:space="preserve">tienda-cluster</w:t>
+      </w:r>
+      <w:r>
+        <w:t xml:space="preserve"> </w:t>
+      </w:r>
+      <w:r>
+        <w:t xml:space="preserve">con los 3 servicios activos (Figura 1).</w:t>
       </w:r>
     </w:p>
     <w:p>
@@ -7047,17 +7046,37 @@
         </w:numPr>
       </w:pPr>
       <w:r>
-        <w:rPr>
-          <w:i/>
-          <w:iCs/>
-        </w:rPr>
-        <w:t xml:space="preserve">Target group</w:t>
-      </w:r>
-      <w:r>
-        <w:t xml:space="preserve"> </w:t>
-      </w:r>
-      <w:r>
-        <w:t xml:space="preserve">del backend con destinos registrados (Figura 6).</w:t>
+        <w:t xml:space="preserve">Security Groups: reglas inbound de</w:t>
+      </w:r>
+      <w:r>
+        <w:t xml:space="preserve"> </w:t>
+      </w:r>
+      <w:r>
+        <w:rPr>
+          <w:rStyle w:val="VerbatimChar"/>
+        </w:rPr>
+        <w:t xml:space="preserve">tienda-alb-sg</w:t>
+      </w:r>
+      <w:r>
+        <w:t xml:space="preserve"> </w:t>
+      </w:r>
+      <w:r>
+        <w:t xml:space="preserve">y</w:t>
+      </w:r>
+      <w:r>
+        <w:t xml:space="preserve"> </w:t>
+      </w:r>
+      <w:r>
+        <w:rPr>
+          <w:rStyle w:val="VerbatimChar"/>
+        </w:rPr>
+        <w:t xml:space="preserve">tienda-ecs-sg</w:t>
+      </w:r>
+      <w:r>
+        <w:t xml:space="preserve"> </w:t>
+      </w:r>
+      <w:r>
+        <w:t xml:space="preserve">(Figuras 2 y 3).</w:t>
       </w:r>
     </w:p>
     <w:p>
@@ -7069,7 +7088,17 @@
         </w:numPr>
       </w:pPr>
       <w:r>
-        <w:t xml:space="preserve">App en el navegador (URL del ALB) con la tabla de productos cargada (Figura 4).</w:t>
+        <w:rPr>
+          <w:i/>
+          <w:iCs/>
+        </w:rPr>
+        <w:t xml:space="preserve">Target group</w:t>
+      </w:r>
+      <w:r>
+        <w:t xml:space="preserve"> </w:t>
+      </w:r>
+      <w:r>
+        <w:t xml:space="preserve">del backend con destinos registrados (Figura 6).</w:t>
       </w:r>
     </w:p>
     <w:p>
@@ -7081,7 +7110,7 @@
         </w:numPr>
       </w:pPr>
       <w:r>
-        <w:t xml:space="preserve">Operación CRUD sobre productos (Figura 4 / demostrada en el video del proceso).</w:t>
+        <w:t xml:space="preserve">App en el navegador (URL del ALB) con la tabla de productos cargada (Figura 4).</w:t>
       </w:r>
     </w:p>
     <w:p>
@@ -7093,7 +7122,7 @@
         </w:numPr>
       </w:pPr>
       <w:r>
-        <w:t xml:space="preserve">CloudWatch Logs del backend (Figura 13).</w:t>
+        <w:t xml:space="preserve">Operación CRUD sobre productos (Figura 4 / demostrada en el video del proceso).</w:t>
       </w:r>
     </w:p>
     <w:p>
@@ -7105,7 +7134,7 @@
         </w:numPr>
       </w:pPr>
       <w:r>
-        <w:t xml:space="preserve">Política de autoscaling + métrica de CPU (Figuras 8 y 9).</w:t>
+        <w:t xml:space="preserve">CloudWatch Logs del backend (Figura 13).</w:t>
       </w:r>
     </w:p>
     <w:p>
@@ -7117,20 +7146,7 @@
         </w:numPr>
       </w:pPr>
       <w:r>
-        <w:t xml:space="preserve">Eventos del servicio (</w:t>
-      </w:r>
-      <w:r>
-        <w:rPr>
-          <w:i/>
-          <w:iCs/>
-        </w:rPr>
-        <w:t xml:space="preserve">steady state</w:t>
-      </w:r>
-      <w:r>
-        <w:t xml:space="preserve"> </w:t>
-      </w:r>
-      <w:r>
-        <w:t xml:space="preserve">/ registro de destinos) (Figura 14).</w:t>
+        <w:t xml:space="preserve">Política de autoscaling + métrica de CPU (Figuras 8 y 9).</w:t>
       </w:r>
     </w:p>
     <w:p>
@@ -7142,7 +7158,20 @@
         </w:numPr>
       </w:pPr>
       <w:r>
-        <w:t xml:space="preserve">Repositorios en Amazon ECR (Figura 7).</w:t>
+        <w:t xml:space="preserve">Eventos del servicio (</w:t>
+      </w:r>
+      <w:r>
+        <w:rPr>
+          <w:i/>
+          <w:iCs/>
+        </w:rPr>
+        <w:t xml:space="preserve">steady state</w:t>
+      </w:r>
+      <w:r>
+        <w:t xml:space="preserve"> </w:t>
+      </w:r>
+      <w:r>
+        <w:t xml:space="preserve">/ registro de destinos) (Figura 14).</w:t>
       </w:r>
     </w:p>
     <w:p>
@@ -7154,7 +7183,7 @@
         </w:numPr>
       </w:pPr>
       <w:r>
-        <w:t xml:space="preserve">Secrets: SSM Parameter Store (Figura 11) y GitHub Actions Secrets (Figura 12).</w:t>
+        <w:t xml:space="preserve">Repositorios en Amazon ECR (Figura 7).</w:t>
       </w:r>
     </w:p>
     <w:p>
@@ -7166,24 +7195,7 @@
         </w:numPr>
       </w:pPr>
       <w:r>
-        <w:t xml:space="preserve">Pipeline de GitHub Actions en verde (Figura 10).</w:t>
-      </w:r>
-    </w:p>
-    <w:p>
-      <w:r>
-        <w:pict>
-          <v:rect style="width:0;height:1.5pt" o:hralign="center" o:hrstd="t" o:hr="t"/>
-        </w:pict>
-      </w:r>
-    </w:p>
-    <w:bookmarkEnd w:id="70"/>
-    <w:bookmarkStart w:id="71" w:name="anexo-b--glosario-rápido-para-la-defensa"/>
-    <w:p>
-      <w:pPr>
-        <w:pStyle w:val="Heading2"/>
-      </w:pPr>
-      <w:r>
-        <w:t xml:space="preserve">Anexo B — Glosario rápido (para la defensa)</w:t>
+        <w:t xml:space="preserve">Secrets: SSM Parameter Store (Figura 11) y GitHub Actions Secrets (Figura 12).</w:t>
       </w:r>
     </w:p>
     <w:p>
@@ -7195,14 +7207,24 @@
         </w:numPr>
       </w:pPr>
       <w:r>
-        <w:rPr>
-          <w:b/>
-          <w:bCs/>
-        </w:rPr>
-        <w:t xml:space="preserve">ECS</w:t>
-      </w:r>
-      <w:r>
-        <w:t xml:space="preserve">: servicio de orquestación de contenedores de AWS.</w:t>
+        <w:t xml:space="preserve">Pipeline de GitHub Actions en verde (Figura 10).</w:t>
+      </w:r>
+    </w:p>
+    <w:p>
+      <w:r>
+        <w:pict>
+          <v:rect style="width:0;height:1.5pt" o:hralign="center" o:hrstd="t" o:hr="t"/>
+        </w:pict>
+      </w:r>
+    </w:p>
+    <w:bookmarkEnd w:id="70"/>
+    <w:bookmarkStart w:id="71" w:name="anexo-b--glosario-rápido-para-la-defensa"/>
+    <w:p>
+      <w:pPr>
+        <w:pStyle w:val="Heading2"/>
+      </w:pPr>
+      <w:r>
+        <w:t xml:space="preserve">Anexo B — Glosario rápido (para la defensa)</w:t>
       </w:r>
     </w:p>
     <w:p>
@@ -7210,7 +7232,7 @@
         <w:pStyle w:val="Compact"/>
         <w:numPr>
           <w:ilvl w:val="0"/>
-          <w:numId w:val="1021"/>
+          <w:numId w:val="1022"/>
         </w:numPr>
       </w:pPr>
       <w:r>
@@ -7218,26 +7240,10 @@
           <w:b/>
           <w:bCs/>
         </w:rPr>
-        <w:t xml:space="preserve">Fargate</w:t>
-      </w:r>
-      <w:r>
-        <w:t xml:space="preserve">: motor</w:t>
-      </w:r>
-      <w:r>
-        <w:t xml:space="preserve"> </w:t>
-      </w:r>
-      <w:r>
-        <w:rPr>
-          <w:i/>
-          <w:iCs/>
-        </w:rPr>
-        <w:t xml:space="preserve">serverless</w:t>
-      </w:r>
-      <w:r>
-        <w:t xml:space="preserve"> </w:t>
-      </w:r>
-      <w:r>
-        <w:t xml:space="preserve">de ECS; AWS administra los servidores subyacentes.</w:t>
+        <w:t xml:space="preserve">ECS</w:t>
+      </w:r>
+      <w:r>
+        <w:t xml:space="preserve">: servicio de orquestación de contenedores de AWS.</w:t>
       </w:r>
     </w:p>
     <w:p>
@@ -7245,7 +7251,7 @@
         <w:pStyle w:val="Compact"/>
         <w:numPr>
           <w:ilvl w:val="0"/>
-          <w:numId w:val="1021"/>
+          <w:numId w:val="1022"/>
         </w:numPr>
       </w:pPr>
       <w:r>
@@ -7253,10 +7259,26 @@
           <w:b/>
           <w:bCs/>
         </w:rPr>
-        <w:t xml:space="preserve">Task Definition</w:t>
-      </w:r>
-      <w:r>
-        <w:t xml:space="preserve">: "plantilla" que describe un contenedor (imagen, CPU/mem, puertos, variables, secrets, logs).</w:t>
+        <w:t xml:space="preserve">Fargate</w:t>
+      </w:r>
+      <w:r>
+        <w:t xml:space="preserve">: motor</w:t>
+      </w:r>
+      <w:r>
+        <w:t xml:space="preserve"> </w:t>
+      </w:r>
+      <w:r>
+        <w:rPr>
+          <w:i/>
+          <w:iCs/>
+        </w:rPr>
+        <w:t xml:space="preserve">serverless</w:t>
+      </w:r>
+      <w:r>
+        <w:t xml:space="preserve"> </w:t>
+      </w:r>
+      <w:r>
+        <w:t xml:space="preserve">de ECS; AWS administra los servidores subyacentes.</w:t>
       </w:r>
     </w:p>
     <w:p>
@@ -7264,7 +7286,7 @@
         <w:pStyle w:val="Compact"/>
         <w:numPr>
           <w:ilvl w:val="0"/>
-          <w:numId w:val="1021"/>
+          <w:numId w:val="1022"/>
         </w:numPr>
       </w:pPr>
       <w:r>
@@ -7272,19 +7294,10 @@
           <w:b/>
           <w:bCs/>
         </w:rPr>
-        <w:t xml:space="preserve">Servicio ECS</w:t>
-      </w:r>
-      <w:r>
-        <w:t xml:space="preserve">: mantiene N tasks corriendo (</w:t>
-      </w:r>
-      <w:r>
-        <w:rPr>
-          <w:rStyle w:val="VerbatimChar"/>
-        </w:rPr>
-        <w:t xml:space="preserve">desiredCount</w:t>
-      </w:r>
-      <w:r>
-        <w:t xml:space="preserve">) y las integra con el balanceador.</w:t>
+        <w:t xml:space="preserve">Task Definition</w:t>
+      </w:r>
+      <w:r>
+        <w:t xml:space="preserve">: "plantilla" que describe un contenedor (imagen, CPU/mem, puertos, variables, secrets, logs).</w:t>
       </w:r>
     </w:p>
     <w:p>
@@ -7292,7 +7305,7 @@
         <w:pStyle w:val="Compact"/>
         <w:numPr>
           <w:ilvl w:val="0"/>
-          <w:numId w:val="1021"/>
+          <w:numId w:val="1022"/>
         </w:numPr>
       </w:pPr>
       <w:r>
@@ -7300,10 +7313,19 @@
           <w:b/>
           <w:bCs/>
         </w:rPr>
-        <w:t xml:space="preserve">ALB / NLB</w:t>
-      </w:r>
-      <w:r>
-        <w:t xml:space="preserve">: balanceadores de capa 7 (HTTP, enruta por ruta) y capa 4 (TCP), respectivamente.</w:t>
+        <w:t xml:space="preserve">Servicio ECS</w:t>
+      </w:r>
+      <w:r>
+        <w:t xml:space="preserve">: mantiene N tasks corriendo (</w:t>
+      </w:r>
+      <w:r>
+        <w:rPr>
+          <w:rStyle w:val="VerbatimChar"/>
+        </w:rPr>
+        <w:t xml:space="preserve">desiredCount</w:t>
+      </w:r>
+      <w:r>
+        <w:t xml:space="preserve">) y las integra con el balanceador.</w:t>
       </w:r>
     </w:p>
     <w:p>
@@ -7311,7 +7333,7 @@
         <w:pStyle w:val="Compact"/>
         <w:numPr>
           <w:ilvl w:val="0"/>
-          <w:numId w:val="1021"/>
+          <w:numId w:val="1022"/>
         </w:numPr>
       </w:pPr>
       <w:r>
@@ -7319,10 +7341,10 @@
           <w:b/>
           <w:bCs/>
         </w:rPr>
-        <w:t xml:space="preserve">Target Group</w:t>
-      </w:r>
-      <w:r>
-        <w:t xml:space="preserve">: conjunto de destinos (tasks) que un balanceador chequea y al que envía tráfico.</w:t>
+        <w:t xml:space="preserve">ALB / NLB</w:t>
+      </w:r>
+      <w:r>
+        <w:t xml:space="preserve">: balanceadores de capa 7 (HTTP, enruta por ruta) y capa 4 (TCP), respectivamente.</w:t>
       </w:r>
     </w:p>
     <w:p>
@@ -7330,7 +7352,7 @@
         <w:pStyle w:val="Compact"/>
         <w:numPr>
           <w:ilvl w:val="0"/>
-          <w:numId w:val="1021"/>
+          <w:numId w:val="1022"/>
         </w:numPr>
       </w:pPr>
       <w:r>
@@ -7338,10 +7360,10 @@
           <w:b/>
           <w:bCs/>
         </w:rPr>
-        <w:t xml:space="preserve">Target Tracking</w:t>
-      </w:r>
-      <w:r>
-        <w:t xml:space="preserve">: política de autoscaling que ajusta el N° de tasks para mantener una métrica en un objetivo (CPU 50%).</w:t>
+        <w:t xml:space="preserve">Target Group</w:t>
+      </w:r>
+      <w:r>
+        <w:t xml:space="preserve">: conjunto de destinos (tasks) que un balanceador chequea y al que envía tráfico.</w:t>
       </w:r>
     </w:p>
     <w:p>
@@ -7349,7 +7371,7 @@
         <w:pStyle w:val="Compact"/>
         <w:numPr>
           <w:ilvl w:val="0"/>
-          <w:numId w:val="1021"/>
+          <w:numId w:val="1022"/>
         </w:numPr>
       </w:pPr>
       <w:r>
@@ -7357,10 +7379,10 @@
           <w:b/>
           <w:bCs/>
         </w:rPr>
-        <w:t xml:space="preserve">Circuit breaker</w:t>
-      </w:r>
-      <w:r>
-        <w:t xml:space="preserve">: mecanismo de ECS que revierte un despliegue si las tasks nuevas no estabilizan.</w:t>
+        <w:t xml:space="preserve">Target Tracking</w:t>
+      </w:r>
+      <w:r>
+        <w:t xml:space="preserve">: política de autoscaling que ajusta el N° de tasks para mantener una métrica en un objetivo (CPU 50%).</w:t>
       </w:r>
     </w:p>
     <w:p>
@@ -7368,7 +7390,7 @@
         <w:pStyle w:val="Compact"/>
         <w:numPr>
           <w:ilvl w:val="0"/>
-          <w:numId w:val="1021"/>
+          <w:numId w:val="1022"/>
         </w:numPr>
       </w:pPr>
       <w:r>
@@ -7376,10 +7398,10 @@
           <w:b/>
           <w:bCs/>
         </w:rPr>
-        <w:t xml:space="preserve">ECR</w:t>
-      </w:r>
-      <w:r>
-        <w:t xml:space="preserve">: registro privado de imágenes Docker de AWS.</w:t>
+        <w:t xml:space="preserve">Circuit breaker</w:t>
+      </w:r>
+      <w:r>
+        <w:t xml:space="preserve">: mecanismo de ECS que revierte un despliegue si las tasks nuevas no estabilizan.</w:t>
       </w:r>
     </w:p>
     <w:p>
@@ -7387,7 +7409,26 @@
         <w:pStyle w:val="Compact"/>
         <w:numPr>
           <w:ilvl w:val="0"/>
-          <w:numId w:val="1021"/>
+          <w:numId w:val="1022"/>
+        </w:numPr>
+      </w:pPr>
+      <w:r>
+        <w:rPr>
+          <w:b/>
+          <w:bCs/>
+        </w:rPr>
+        <w:t xml:space="preserve">ECR</w:t>
+      </w:r>
+      <w:r>
+        <w:t xml:space="preserve">: registro privado de imágenes Docker de AWS.</w:t>
+      </w:r>
+    </w:p>
+    <w:p>
+      <w:pPr>
+        <w:pStyle w:val="Compact"/>
+        <w:numPr>
+          <w:ilvl w:val="0"/>
+          <w:numId w:val="1022"/>
         </w:numPr>
       </w:pPr>
       <w:r>
@@ -7790,6 +7831,9 @@
     <w:abstractNumId w:val="991"/>
   </w:num>
   <w:num w:numId="1004">
+    <w:abstractNumId w:val="991"/>
+  </w:num>
+  <w:num w:numId="1005">
     <w:abstractNumId w:val="99411"/>
     <w:lvlOverride w:ilvl="0">
       <w:startOverride w:val="1"/>
@@ -7819,41 +7863,11 @@
       <w:startOverride w:val="1"/>
     </w:lvlOverride>
   </w:num>
-  <w:num w:numId="1005">
-    <w:abstractNumId w:val="991"/>
-  </w:num>
   <w:num w:numId="1006">
     <w:abstractNumId w:val="991"/>
   </w:num>
   <w:num w:numId="1007">
-    <w:abstractNumId w:val="99411"/>
-    <w:lvlOverride w:ilvl="0">
-      <w:startOverride w:val="1"/>
-    </w:lvlOverride>
-    <w:lvlOverride w:ilvl="1">
-      <w:startOverride w:val="1"/>
-    </w:lvlOverride>
-    <w:lvlOverride w:ilvl="2">
-      <w:startOverride w:val="1"/>
-    </w:lvlOverride>
-    <w:lvlOverride w:ilvl="3">
-      <w:startOverride w:val="1"/>
-    </w:lvlOverride>
-    <w:lvlOverride w:ilvl="4">
-      <w:startOverride w:val="1"/>
-    </w:lvlOverride>
-    <w:lvlOverride w:ilvl="5">
-      <w:startOverride w:val="1"/>
-    </w:lvlOverride>
-    <w:lvlOverride w:ilvl="6">
-      <w:startOverride w:val="1"/>
-    </w:lvlOverride>
-    <w:lvlOverride w:ilvl="7">
-      <w:startOverride w:val="1"/>
-    </w:lvlOverride>
-    <w:lvlOverride w:ilvl="8">
-      <w:startOverride w:val="1"/>
-    </w:lvlOverride>
+    <w:abstractNumId w:val="991"/>
   </w:num>
   <w:num w:numId="1008">
     <w:abstractNumId w:val="99411"/>
@@ -7886,10 +7900,37 @@
     </w:lvlOverride>
   </w:num>
   <w:num w:numId="1009">
-    <w:abstractNumId w:val="991"/>
+    <w:abstractNumId w:val="99411"/>
+    <w:lvlOverride w:ilvl="0">
+      <w:startOverride w:val="1"/>
+    </w:lvlOverride>
+    <w:lvlOverride w:ilvl="1">
+      <w:startOverride w:val="1"/>
+    </w:lvlOverride>
+    <w:lvlOverride w:ilvl="2">
+      <w:startOverride w:val="1"/>
+    </w:lvlOverride>
+    <w:lvlOverride w:ilvl="3">
+      <w:startOverride w:val="1"/>
+    </w:lvlOverride>
+    <w:lvlOverride w:ilvl="4">
+      <w:startOverride w:val="1"/>
+    </w:lvlOverride>
+    <w:lvlOverride w:ilvl="5">
+      <w:startOverride w:val="1"/>
+    </w:lvlOverride>
+    <w:lvlOverride w:ilvl="6">
+      <w:startOverride w:val="1"/>
+    </w:lvlOverride>
+    <w:lvlOverride w:ilvl="7">
+      <w:startOverride w:val="1"/>
+    </w:lvlOverride>
+    <w:lvlOverride w:ilvl="8">
+      <w:startOverride w:val="1"/>
+    </w:lvlOverride>
   </w:num>
   <w:num w:numId="1010">
-    <w:abstractNumId w:val="993"/>
+    <w:abstractNumId w:val="991"/>
   </w:num>
   <w:num w:numId="1011">
     <w:abstractNumId w:val="993"/>
@@ -7922,6 +7963,9 @@
     <w:abstractNumId w:val="993"/>
   </w:num>
   <w:num w:numId="1021">
+    <w:abstractNumId w:val="993"/>
+  </w:num>
+  <w:num w:numId="1022">
     <w:abstractNumId w:val="991"/>
   </w:num>
 </w:numbering>

</xml_diff>